<commit_message>
docs: cap nhat toan bo cong thuc toan hoc sang dinh dang Word Equation chuan trong bao cao Phan 4
</commit_message>
<xml_diff>
--- a/Bao_Cao_Phan_4_Du_Doan_Gia_Laptop.docx
+++ b/Bao_Cao_Phan_4_Du_Doan_Gia_Laptop.docx
@@ -4,7 +4,7 @@
   <w:body>
     <w:p>
       <w:pPr>
-        <w:spacing w:before="200" w:after="80"/>
+        <w:spacing w:before="160" w:after="80"/>
         <w:jc w:val="center"/>
       </w:pPr>
       <w:r>
@@ -39,7 +39,7 @@
     </w:p>
     <w:p>
       <w:pPr>
-        <w:spacing w:after="360"/>
+        <w:spacing w:after="320"/>
         <w:jc w:val="center"/>
       </w:pPr>
       <w:r>
@@ -155,7 +155,7 @@
         <w:br/>
       </w:r>
       <w:r>
-        <w:t>Thị trường laptop hiện nay vô cùng đa dạng với hàng trăm mẫu mã, linh kiện và mức giá biến động từ phân khúc bình dân (dưới 10 triệu đồng) đến phân khúc máy trạm đồ họa chuyên nghiệp và gaming cao cấp (trên 60 triệu đồng). Người tiêu dùng, đặc biệt là sinh viên và người đi làm, thường gặp khó khăn trong việc định giá một cấu hình phần cứng: 'Liệu mức giá niêm yết có tương xứng với hiệu năng thực tế hay không?'. Phần 4 của dự án LapInsight giải quyết trọn vẹn bài toán này bằng cách ứng dụng Học máy có giám sát (Supervised Regression) để tự động hóa quá trình ước tính giá bán laptop dựa trên thông số kỹ thuật thực tế, kết hợp bộ đề xuất 5 sản phẩm tương đồng.</w:t>
+        <w:t>Thị trường máy tính xách tay hiện nay vô cùng phong phú và biến động không ngừng, với hàng trăm dòng sản phẩm thuộc nhiều phân khúc từ học tập cơ bản (dưới 10 triệu VNĐ) cho đến dòng đồ họa cao cấp và gaming chuyên nghiệp (trên 60 triệu VNĐ). Người tiêu dùng thường xuyên đối mặt với câu hỏi khó: 'Với cấu hình phần cứng này thì mức giá nào là hợp lý và đúng với giá trị thực tế?'. Phần 4 của dự án LapInsight giải quyết bài toán cốt lõi này bằng kỹ thuật Học máy có giám sát (Supervised Machine Learning Regression), cho phép tự động lượng hóa mối tương quan đa biến phức tạp giữa 9 thông số kỹ thuật phần cứng và giá bán thị trường.</w:t>
       </w:r>
     </w:p>
     <w:p>
@@ -167,7 +167,7 @@
         <w:br/>
       </w:r>
       <w:r>
-        <w:t>Mô hình sử dụng 9 biến độc lập đại diện toàn diện cho sức mạnh phần cứng, tính cơ động và trải nghiệm hiển thị của laptop:</w:t>
+        <w:t>Không gian đặc trưng đầu vào X bao gồm 9 biến số đại diện cho hiệu năng, dung lượng lưu trữ, màn hình, trọng lượng và pin:</w:t>
       </w:r>
     </w:p>
     <w:tbl>
@@ -188,10 +188,10 @@
             <w:tcW w:type="dxa" w:w="2329"/>
             <w:shd w:val="clear" w:color="auto" w:fill="0D6EFD"/>
             <w:tcMar>
-              <w:top w:w="120" w:type="dxa"/>
-              <w:bottom w:w="120" w:type="dxa"/>
-              <w:left w:w="150" w:type="dxa"/>
-              <w:right w:w="150" w:type="dxa"/>
+              <w:top w:w="140" w:type="dxa"/>
+              <w:bottom w:w="140" w:type="dxa"/>
+              <w:left w:w="180" w:type="dxa"/>
+              <w:right w:w="180" w:type="dxa"/>
             </w:tcMar>
           </w:tcPr>
           <w:p>
@@ -212,10 +212,10 @@
             <w:tcW w:type="dxa" w:w="2329"/>
             <w:shd w:val="clear" w:color="auto" w:fill="0D6EFD"/>
             <w:tcMar>
-              <w:top w:w="120" w:type="dxa"/>
-              <w:bottom w:w="120" w:type="dxa"/>
-              <w:left w:w="150" w:type="dxa"/>
-              <w:right w:w="150" w:type="dxa"/>
+              <w:top w:w="140" w:type="dxa"/>
+              <w:bottom w:w="140" w:type="dxa"/>
+              <w:left w:w="180" w:type="dxa"/>
+              <w:right w:w="180" w:type="dxa"/>
             </w:tcMar>
           </w:tcPr>
           <w:p>
@@ -236,10 +236,10 @@
             <w:tcW w:type="dxa" w:w="2329"/>
             <w:shd w:val="clear" w:color="auto" w:fill="0D6EFD"/>
             <w:tcMar>
-              <w:top w:w="120" w:type="dxa"/>
-              <w:bottom w:w="120" w:type="dxa"/>
-              <w:left w:w="150" w:type="dxa"/>
-              <w:right w:w="150" w:type="dxa"/>
+              <w:top w:w="140" w:type="dxa"/>
+              <w:bottom w:w="140" w:type="dxa"/>
+              <w:left w:w="180" w:type="dxa"/>
+              <w:right w:w="180" w:type="dxa"/>
             </w:tcMar>
           </w:tcPr>
           <w:p>
@@ -260,10 +260,10 @@
             <w:tcW w:type="dxa" w:w="2329"/>
             <w:shd w:val="clear" w:color="auto" w:fill="0D6EFD"/>
             <w:tcMar>
-              <w:top w:w="120" w:type="dxa"/>
-              <w:bottom w:w="120" w:type="dxa"/>
-              <w:left w:w="150" w:type="dxa"/>
-              <w:right w:w="150" w:type="dxa"/>
+              <w:top w:w="140" w:type="dxa"/>
+              <w:bottom w:w="140" w:type="dxa"/>
+              <w:left w:w="180" w:type="dxa"/>
+              <w:right w:w="180" w:type="dxa"/>
             </w:tcMar>
           </w:tcPr>
           <w:p>
@@ -275,7 +275,7 @@
                 <w:b/>
                 <w:color w:val="FFFFFF"/>
               </w:rPr>
-              <w:t>Ý nghĩa &amp; Chuẩn đo lường</w:t>
+              <w:t>Ý nghĩa &amp; Tiêu chuẩn đo lường</w:t>
             </w:r>
           </w:p>
         </w:tc>
@@ -286,10 +286,10 @@
             <w:tcW w:type="dxa" w:w="2329"/>
             <w:shd w:val="clear" w:color="auto" w:fill="F8F9FA"/>
             <w:tcMar>
-              <w:top w:w="120" w:type="dxa"/>
-              <w:bottom w:w="120" w:type="dxa"/>
-              <w:left w:w="150" w:type="dxa"/>
-              <w:right w:w="150" w:type="dxa"/>
+              <w:top w:w="140" w:type="dxa"/>
+              <w:bottom w:w="140" w:type="dxa"/>
+              <w:left w:w="180" w:type="dxa"/>
+              <w:right w:w="180" w:type="dxa"/>
             </w:tcMar>
           </w:tcPr>
           <w:p>
@@ -306,10 +306,10 @@
             <w:tcW w:type="dxa" w:w="2329"/>
             <w:shd w:val="clear" w:color="auto" w:fill="F8F9FA"/>
             <w:tcMar>
-              <w:top w:w="120" w:type="dxa"/>
-              <w:bottom w:w="120" w:type="dxa"/>
-              <w:left w:w="150" w:type="dxa"/>
-              <w:right w:w="150" w:type="dxa"/>
+              <w:top w:w="140" w:type="dxa"/>
+              <w:bottom w:w="140" w:type="dxa"/>
+              <w:left w:w="180" w:type="dxa"/>
+              <w:right w:w="180" w:type="dxa"/>
             </w:tcMar>
           </w:tcPr>
           <w:p>
@@ -323,10 +323,10 @@
             <w:tcW w:type="dxa" w:w="2329"/>
             <w:shd w:val="clear" w:color="auto" w:fill="F8F9FA"/>
             <w:tcMar>
-              <w:top w:w="120" w:type="dxa"/>
-              <w:bottom w:w="120" w:type="dxa"/>
-              <w:left w:w="150" w:type="dxa"/>
-              <w:right w:w="150" w:type="dxa"/>
+              <w:top w:w="140" w:type="dxa"/>
+              <w:bottom w:w="140" w:type="dxa"/>
+              <w:left w:w="180" w:type="dxa"/>
+              <w:right w:w="180" w:type="dxa"/>
             </w:tcMar>
           </w:tcPr>
           <w:p>
@@ -343,15 +343,15 @@
             <w:tcW w:type="dxa" w:w="2329"/>
             <w:shd w:val="clear" w:color="auto" w:fill="F8F9FA"/>
             <w:tcMar>
-              <w:top w:w="120" w:type="dxa"/>
-              <w:bottom w:w="120" w:type="dxa"/>
-              <w:left w:w="150" w:type="dxa"/>
-              <w:right w:w="150" w:type="dxa"/>
+              <w:top w:w="140" w:type="dxa"/>
+              <w:bottom w:w="140" w:type="dxa"/>
+              <w:left w:w="180" w:type="dxa"/>
+              <w:right w:w="180" w:type="dxa"/>
             </w:tcMar>
           </w:tcPr>
           <w:p>
             <w:r>
-              <w:t>Điểm hiệu năng PassMark CPU Mark tổng thể đa nhân (PassMark 2026).</w:t>
+              <w:t>Điểm hiệu năng PassMark CPU Mark tổng hợp (PassMark 2026).</w:t>
             </w:r>
           </w:p>
         </w:tc>
@@ -362,10 +362,10 @@
             <w:tcW w:type="dxa" w:w="2329"/>
             <w:shd w:val="clear" w:color="auto" w:fill="FFFFFF"/>
             <w:tcMar>
-              <w:top w:w="120" w:type="dxa"/>
-              <w:bottom w:w="120" w:type="dxa"/>
-              <w:left w:w="150" w:type="dxa"/>
-              <w:right w:w="150" w:type="dxa"/>
+              <w:top w:w="140" w:type="dxa"/>
+              <w:bottom w:w="140" w:type="dxa"/>
+              <w:left w:w="180" w:type="dxa"/>
+              <w:right w:w="180" w:type="dxa"/>
             </w:tcMar>
           </w:tcPr>
           <w:p>
@@ -382,10 +382,10 @@
             <w:tcW w:type="dxa" w:w="2329"/>
             <w:shd w:val="clear" w:color="auto" w:fill="FFFFFF"/>
             <w:tcMar>
-              <w:top w:w="120" w:type="dxa"/>
-              <w:bottom w:w="120" w:type="dxa"/>
-              <w:left w:w="150" w:type="dxa"/>
-              <w:right w:w="150" w:type="dxa"/>
+              <w:top w:w="140" w:type="dxa"/>
+              <w:bottom w:w="140" w:type="dxa"/>
+              <w:left w:w="180" w:type="dxa"/>
+              <w:right w:w="180" w:type="dxa"/>
             </w:tcMar>
           </w:tcPr>
           <w:p>
@@ -399,10 +399,10 @@
             <w:tcW w:type="dxa" w:w="2329"/>
             <w:shd w:val="clear" w:color="auto" w:fill="FFFFFF"/>
             <w:tcMar>
-              <w:top w:w="120" w:type="dxa"/>
-              <w:bottom w:w="120" w:type="dxa"/>
-              <w:left w:w="150" w:type="dxa"/>
-              <w:right w:w="150" w:type="dxa"/>
+              <w:top w:w="140" w:type="dxa"/>
+              <w:bottom w:w="140" w:type="dxa"/>
+              <w:left w:w="180" w:type="dxa"/>
+              <w:right w:w="180" w:type="dxa"/>
             </w:tcMar>
           </w:tcPr>
           <w:p>
@@ -419,15 +419,15 @@
             <w:tcW w:type="dxa" w:w="2329"/>
             <w:shd w:val="clear" w:color="auto" w:fill="FFFFFF"/>
             <w:tcMar>
-              <w:top w:w="120" w:type="dxa"/>
-              <w:bottom w:w="120" w:type="dxa"/>
-              <w:left w:w="150" w:type="dxa"/>
-              <w:right w:w="150" w:type="dxa"/>
+              <w:top w:w="140" w:type="dxa"/>
+              <w:bottom w:w="140" w:type="dxa"/>
+              <w:left w:w="180" w:type="dxa"/>
+              <w:right w:w="180" w:type="dxa"/>
             </w:tcMar>
           </w:tcPr>
           <w:p>
             <w:r>
-              <w:t>Điểm đồ họa 3D PassMark G3D Mark (NVIDIA GeForce, Intel Arc, AMD).</w:t>
+              <w:t>Điểm đồ họa PassMark G3D Mark (NVIDIA RTX, Intel Arc/Iris, AMD Radeon).</w:t>
             </w:r>
           </w:p>
         </w:tc>
@@ -438,10 +438,10 @@
             <w:tcW w:type="dxa" w:w="2329"/>
             <w:shd w:val="clear" w:color="auto" w:fill="F8F9FA"/>
             <w:tcMar>
-              <w:top w:w="120" w:type="dxa"/>
-              <w:bottom w:w="120" w:type="dxa"/>
-              <w:left w:w="150" w:type="dxa"/>
-              <w:right w:w="150" w:type="dxa"/>
+              <w:top w:w="140" w:type="dxa"/>
+              <w:bottom w:w="140" w:type="dxa"/>
+              <w:left w:w="180" w:type="dxa"/>
+              <w:right w:w="180" w:type="dxa"/>
             </w:tcMar>
           </w:tcPr>
           <w:p>
@@ -458,10 +458,10 @@
             <w:tcW w:type="dxa" w:w="2329"/>
             <w:shd w:val="clear" w:color="auto" w:fill="F8F9FA"/>
             <w:tcMar>
-              <w:top w:w="120" w:type="dxa"/>
-              <w:bottom w:w="120" w:type="dxa"/>
-              <w:left w:w="150" w:type="dxa"/>
-              <w:right w:w="150" w:type="dxa"/>
+              <w:top w:w="140" w:type="dxa"/>
+              <w:bottom w:w="140" w:type="dxa"/>
+              <w:left w:w="180" w:type="dxa"/>
+              <w:right w:w="180" w:type="dxa"/>
             </w:tcMar>
           </w:tcPr>
           <w:p>
@@ -475,10 +475,10 @@
             <w:tcW w:type="dxa" w:w="2329"/>
             <w:shd w:val="clear" w:color="auto" w:fill="F8F9FA"/>
             <w:tcMar>
-              <w:top w:w="120" w:type="dxa"/>
-              <w:bottom w:w="120" w:type="dxa"/>
-              <w:left w:w="150" w:type="dxa"/>
-              <w:right w:w="150" w:type="dxa"/>
+              <w:top w:w="140" w:type="dxa"/>
+              <w:bottom w:w="140" w:type="dxa"/>
+              <w:left w:w="180" w:type="dxa"/>
+              <w:right w:w="180" w:type="dxa"/>
             </w:tcMar>
           </w:tcPr>
           <w:p>
@@ -495,10 +495,10 @@
             <w:tcW w:type="dxa" w:w="2329"/>
             <w:shd w:val="clear" w:color="auto" w:fill="F8F9FA"/>
             <w:tcMar>
-              <w:top w:w="120" w:type="dxa"/>
-              <w:bottom w:w="120" w:type="dxa"/>
-              <w:left w:w="150" w:type="dxa"/>
-              <w:right w:w="150" w:type="dxa"/>
+              <w:top w:w="140" w:type="dxa"/>
+              <w:bottom w:w="140" w:type="dxa"/>
+              <w:left w:w="180" w:type="dxa"/>
+              <w:right w:w="180" w:type="dxa"/>
             </w:tcMar>
           </w:tcPr>
           <w:p>
@@ -514,10 +514,10 @@
             <w:tcW w:type="dxa" w:w="2329"/>
             <w:shd w:val="clear" w:color="auto" w:fill="FFFFFF"/>
             <w:tcMar>
-              <w:top w:w="120" w:type="dxa"/>
-              <w:bottom w:w="120" w:type="dxa"/>
-              <w:left w:w="150" w:type="dxa"/>
-              <w:right w:w="150" w:type="dxa"/>
+              <w:top w:w="140" w:type="dxa"/>
+              <w:bottom w:w="140" w:type="dxa"/>
+              <w:left w:w="180" w:type="dxa"/>
+              <w:right w:w="180" w:type="dxa"/>
             </w:tcMar>
           </w:tcPr>
           <w:p>
@@ -534,10 +534,10 @@
             <w:tcW w:type="dxa" w:w="2329"/>
             <w:shd w:val="clear" w:color="auto" w:fill="FFFFFF"/>
             <w:tcMar>
-              <w:top w:w="120" w:type="dxa"/>
-              <w:bottom w:w="120" w:type="dxa"/>
-              <w:left w:w="150" w:type="dxa"/>
-              <w:right w:w="150" w:type="dxa"/>
+              <w:top w:w="140" w:type="dxa"/>
+              <w:bottom w:w="140" w:type="dxa"/>
+              <w:left w:w="180" w:type="dxa"/>
+              <w:right w:w="180" w:type="dxa"/>
             </w:tcMar>
           </w:tcPr>
           <w:p>
@@ -551,10 +551,10 @@
             <w:tcW w:type="dxa" w:w="2329"/>
             <w:shd w:val="clear" w:color="auto" w:fill="FFFFFF"/>
             <w:tcMar>
-              <w:top w:w="120" w:type="dxa"/>
-              <w:bottom w:w="120" w:type="dxa"/>
-              <w:left w:w="150" w:type="dxa"/>
-              <w:right w:w="150" w:type="dxa"/>
+              <w:top w:w="140" w:type="dxa"/>
+              <w:bottom w:w="140" w:type="dxa"/>
+              <w:left w:w="180" w:type="dxa"/>
+              <w:right w:w="180" w:type="dxa"/>
             </w:tcMar>
           </w:tcPr>
           <w:p>
@@ -571,15 +571,15 @@
             <w:tcW w:type="dxa" w:w="2329"/>
             <w:shd w:val="clear" w:color="auto" w:fill="FFFFFF"/>
             <w:tcMar>
-              <w:top w:w="120" w:type="dxa"/>
-              <w:bottom w:w="120" w:type="dxa"/>
-              <w:left w:w="150" w:type="dxa"/>
-              <w:right w:w="150" w:type="dxa"/>
+              <w:top w:w="140" w:type="dxa"/>
+              <w:bottom w:w="140" w:type="dxa"/>
+              <w:left w:w="180" w:type="dxa"/>
+              <w:right w:w="180" w:type="dxa"/>
             </w:tcMar>
           </w:tcPr>
           <w:p>
             <w:r>
-              <w:t>Dung lượng ổ lưu trữ thể rắn SSD NVMe (256, 512, 1024, 2048 GB).</w:t>
+              <w:t>Dung lượng ổ cứng lưu trữ thể rắn SSD NVMe (256, 512, 1024, 2048 GB).</w:t>
             </w:r>
           </w:p>
         </w:tc>
@@ -590,10 +590,10 @@
             <w:tcW w:type="dxa" w:w="2329"/>
             <w:shd w:val="clear" w:color="auto" w:fill="F8F9FA"/>
             <w:tcMar>
-              <w:top w:w="120" w:type="dxa"/>
-              <w:bottom w:w="120" w:type="dxa"/>
-              <w:left w:w="150" w:type="dxa"/>
-              <w:right w:w="150" w:type="dxa"/>
+              <w:top w:w="140" w:type="dxa"/>
+              <w:bottom w:w="140" w:type="dxa"/>
+              <w:left w:w="180" w:type="dxa"/>
+              <w:right w:w="180" w:type="dxa"/>
             </w:tcMar>
           </w:tcPr>
           <w:p>
@@ -610,10 +610,10 @@
             <w:tcW w:type="dxa" w:w="2329"/>
             <w:shd w:val="clear" w:color="auto" w:fill="F8F9FA"/>
             <w:tcMar>
-              <w:top w:w="120" w:type="dxa"/>
-              <w:bottom w:w="120" w:type="dxa"/>
-              <w:left w:w="150" w:type="dxa"/>
-              <w:right w:w="150" w:type="dxa"/>
+              <w:top w:w="140" w:type="dxa"/>
+              <w:bottom w:w="140" w:type="dxa"/>
+              <w:left w:w="180" w:type="dxa"/>
+              <w:right w:w="180" w:type="dxa"/>
             </w:tcMar>
           </w:tcPr>
           <w:p>
@@ -627,10 +627,10 @@
             <w:tcW w:type="dxa" w:w="2329"/>
             <w:shd w:val="clear" w:color="auto" w:fill="F8F9FA"/>
             <w:tcMar>
-              <w:top w:w="120" w:type="dxa"/>
-              <w:bottom w:w="120" w:type="dxa"/>
-              <w:left w:w="150" w:type="dxa"/>
-              <w:right w:w="150" w:type="dxa"/>
+              <w:top w:w="140" w:type="dxa"/>
+              <w:bottom w:w="140" w:type="dxa"/>
+              <w:left w:w="180" w:type="dxa"/>
+              <w:right w:w="180" w:type="dxa"/>
             </w:tcMar>
           </w:tcPr>
           <w:p>
@@ -647,10 +647,10 @@
             <w:tcW w:type="dxa" w:w="2329"/>
             <w:shd w:val="clear" w:color="auto" w:fill="F8F9FA"/>
             <w:tcMar>
-              <w:top w:w="120" w:type="dxa"/>
-              <w:bottom w:w="120" w:type="dxa"/>
-              <w:left w:w="150" w:type="dxa"/>
-              <w:right w:w="150" w:type="dxa"/>
+              <w:top w:w="140" w:type="dxa"/>
+              <w:bottom w:w="140" w:type="dxa"/>
+              <w:left w:w="180" w:type="dxa"/>
+              <w:right w:w="180" w:type="dxa"/>
             </w:tcMar>
           </w:tcPr>
           <w:p>
@@ -666,10 +666,10 @@
             <w:tcW w:type="dxa" w:w="2329"/>
             <w:shd w:val="clear" w:color="auto" w:fill="FFFFFF"/>
             <w:tcMar>
-              <w:top w:w="120" w:type="dxa"/>
-              <w:bottom w:w="120" w:type="dxa"/>
-              <w:left w:w="150" w:type="dxa"/>
-              <w:right w:w="150" w:type="dxa"/>
+              <w:top w:w="140" w:type="dxa"/>
+              <w:bottom w:w="140" w:type="dxa"/>
+              <w:left w:w="180" w:type="dxa"/>
+              <w:right w:w="180" w:type="dxa"/>
             </w:tcMar>
           </w:tcPr>
           <w:p>
@@ -686,10 +686,10 @@
             <w:tcW w:type="dxa" w:w="2329"/>
             <w:shd w:val="clear" w:color="auto" w:fill="FFFFFF"/>
             <w:tcMar>
-              <w:top w:w="120" w:type="dxa"/>
-              <w:bottom w:w="120" w:type="dxa"/>
-              <w:left w:w="150" w:type="dxa"/>
-              <w:right w:w="150" w:type="dxa"/>
+              <w:top w:w="140" w:type="dxa"/>
+              <w:bottom w:w="140" w:type="dxa"/>
+              <w:left w:w="180" w:type="dxa"/>
+              <w:right w:w="180" w:type="dxa"/>
             </w:tcMar>
           </w:tcPr>
           <w:p>
@@ -703,10 +703,10 @@
             <w:tcW w:type="dxa" w:w="2329"/>
             <w:shd w:val="clear" w:color="auto" w:fill="FFFFFF"/>
             <w:tcMar>
-              <w:top w:w="120" w:type="dxa"/>
-              <w:bottom w:w="120" w:type="dxa"/>
-              <w:left w:w="150" w:type="dxa"/>
-              <w:right w:w="150" w:type="dxa"/>
+              <w:top w:w="140" w:type="dxa"/>
+              <w:bottom w:w="140" w:type="dxa"/>
+              <w:left w:w="180" w:type="dxa"/>
+              <w:right w:w="180" w:type="dxa"/>
             </w:tcMar>
           </w:tcPr>
           <w:p>
@@ -723,15 +723,15 @@
             <w:tcW w:type="dxa" w:w="2329"/>
             <w:shd w:val="clear" w:color="auto" w:fill="FFFFFF"/>
             <w:tcMar>
-              <w:top w:w="120" w:type="dxa"/>
-              <w:bottom w:w="120" w:type="dxa"/>
-              <w:left w:w="150" w:type="dxa"/>
-              <w:right w:w="150" w:type="dxa"/>
+              <w:top w:w="140" w:type="dxa"/>
+              <w:bottom w:w="140" w:type="dxa"/>
+              <w:left w:w="180" w:type="dxa"/>
+              <w:right w:w="180" w:type="dxa"/>
             </w:tcMar>
           </w:tcPr>
           <w:p>
             <w:r>
-              <w:t>Tần số quét làm mới khung hình của màn hình (60, 90, 120, 144, 165, 240 Hz).</w:t>
+              <w:t>Tần số quét làm tươi màn hình (60, 90, 120, 144, 165, 240 Hz).</w:t>
             </w:r>
           </w:p>
         </w:tc>
@@ -742,10 +742,10 @@
             <w:tcW w:type="dxa" w:w="2329"/>
             <w:shd w:val="clear" w:color="auto" w:fill="F8F9FA"/>
             <w:tcMar>
-              <w:top w:w="120" w:type="dxa"/>
-              <w:bottom w:w="120" w:type="dxa"/>
-              <w:left w:w="150" w:type="dxa"/>
-              <w:right w:w="150" w:type="dxa"/>
+              <w:top w:w="140" w:type="dxa"/>
+              <w:bottom w:w="140" w:type="dxa"/>
+              <w:left w:w="180" w:type="dxa"/>
+              <w:right w:w="180" w:type="dxa"/>
             </w:tcMar>
           </w:tcPr>
           <w:p>
@@ -762,10 +762,10 @@
             <w:tcW w:type="dxa" w:w="2329"/>
             <w:shd w:val="clear" w:color="auto" w:fill="F8F9FA"/>
             <w:tcMar>
-              <w:top w:w="120" w:type="dxa"/>
-              <w:bottom w:w="120" w:type="dxa"/>
-              <w:left w:w="150" w:type="dxa"/>
-              <w:right w:w="150" w:type="dxa"/>
+              <w:top w:w="140" w:type="dxa"/>
+              <w:bottom w:w="140" w:type="dxa"/>
+              <w:left w:w="180" w:type="dxa"/>
+              <w:right w:w="180" w:type="dxa"/>
             </w:tcMar>
           </w:tcPr>
           <w:p>
@@ -779,10 +779,10 @@
             <w:tcW w:type="dxa" w:w="2329"/>
             <w:shd w:val="clear" w:color="auto" w:fill="F8F9FA"/>
             <w:tcMar>
-              <w:top w:w="120" w:type="dxa"/>
-              <w:bottom w:w="120" w:type="dxa"/>
-              <w:left w:w="150" w:type="dxa"/>
-              <w:right w:w="150" w:type="dxa"/>
+              <w:top w:w="140" w:type="dxa"/>
+              <w:bottom w:w="140" w:type="dxa"/>
+              <w:left w:w="180" w:type="dxa"/>
+              <w:right w:w="180" w:type="dxa"/>
             </w:tcMar>
           </w:tcPr>
           <w:p>
@@ -799,15 +799,15 @@
             <w:tcW w:type="dxa" w:w="2329"/>
             <w:shd w:val="clear" w:color="auto" w:fill="F8F9FA"/>
             <w:tcMar>
-              <w:top w:w="120" w:type="dxa"/>
-              <w:bottom w:w="120" w:type="dxa"/>
-              <w:left w:w="150" w:type="dxa"/>
-              <w:right w:w="150" w:type="dxa"/>
+              <w:top w:w="140" w:type="dxa"/>
+              <w:bottom w:w="140" w:type="dxa"/>
+              <w:left w:w="180" w:type="dxa"/>
+              <w:right w:w="180" w:type="dxa"/>
             </w:tcMar>
           </w:tcPr>
           <w:p>
             <w:r>
-              <w:t>Trọng lượng vật lý của laptop theo công bố nhà sản xuất (0.96 kg - 2.8 kg).</w:t>
+              <w:t>Khối lượng vật lý của máy theo công bố nhà sản xuất (0.96 kg - 2.8 kg).</w:t>
             </w:r>
           </w:p>
         </w:tc>
@@ -818,10 +818,10 @@
             <w:tcW w:type="dxa" w:w="2329"/>
             <w:shd w:val="clear" w:color="auto" w:fill="FFFFFF"/>
             <w:tcMar>
-              <w:top w:w="120" w:type="dxa"/>
-              <w:bottom w:w="120" w:type="dxa"/>
-              <w:left w:w="150" w:type="dxa"/>
-              <w:right w:w="150" w:type="dxa"/>
+              <w:top w:w="140" w:type="dxa"/>
+              <w:bottom w:w="140" w:type="dxa"/>
+              <w:left w:w="180" w:type="dxa"/>
+              <w:right w:w="180" w:type="dxa"/>
             </w:tcMar>
           </w:tcPr>
           <w:p>
@@ -838,10 +838,10 @@
             <w:tcW w:type="dxa" w:w="2329"/>
             <w:shd w:val="clear" w:color="auto" w:fill="FFFFFF"/>
             <w:tcMar>
-              <w:top w:w="120" w:type="dxa"/>
-              <w:bottom w:w="120" w:type="dxa"/>
-              <w:left w:w="150" w:type="dxa"/>
-              <w:right w:w="150" w:type="dxa"/>
+              <w:top w:w="140" w:type="dxa"/>
+              <w:bottom w:w="140" w:type="dxa"/>
+              <w:left w:w="180" w:type="dxa"/>
+              <w:right w:w="180" w:type="dxa"/>
             </w:tcMar>
           </w:tcPr>
           <w:p>
@@ -855,10 +855,10 @@
             <w:tcW w:type="dxa" w:w="2329"/>
             <w:shd w:val="clear" w:color="auto" w:fill="FFFFFF"/>
             <w:tcMar>
-              <w:top w:w="120" w:type="dxa"/>
-              <w:bottom w:w="120" w:type="dxa"/>
-              <w:left w:w="150" w:type="dxa"/>
-              <w:right w:w="150" w:type="dxa"/>
+              <w:top w:w="140" w:type="dxa"/>
+              <w:bottom w:w="140" w:type="dxa"/>
+              <w:left w:w="180" w:type="dxa"/>
+              <w:right w:w="180" w:type="dxa"/>
             </w:tcMar>
           </w:tcPr>
           <w:p>
@@ -875,15 +875,15 @@
             <w:tcW w:type="dxa" w:w="2329"/>
             <w:shd w:val="clear" w:color="auto" w:fill="FFFFFF"/>
             <w:tcMar>
-              <w:top w:w="120" w:type="dxa"/>
-              <w:bottom w:w="120" w:type="dxa"/>
-              <w:left w:w="150" w:type="dxa"/>
-              <w:right w:w="150" w:type="dxa"/>
+              <w:top w:w="140" w:type="dxa"/>
+              <w:bottom w:w="140" w:type="dxa"/>
+              <w:left w:w="180" w:type="dxa"/>
+              <w:right w:w="180" w:type="dxa"/>
             </w:tcMar>
           </w:tcPr>
           <w:p>
             <w:r>
-              <w:t>Dung lượng pin năng lượng tính theo Watt-giờ (Watt-hour: 38 Wh - 99.9 Wh).</w:t>
+              <w:t>Dung lượng pin tính theo Watt-giờ (Watt-hour: 38 Wh - 99.9 Wh).</w:t>
             </w:r>
           </w:p>
         </w:tc>
@@ -894,10 +894,10 @@
             <w:tcW w:type="dxa" w:w="2329"/>
             <w:shd w:val="clear" w:color="auto" w:fill="F8F9FA"/>
             <w:tcMar>
-              <w:top w:w="120" w:type="dxa"/>
-              <w:bottom w:w="120" w:type="dxa"/>
-              <w:left w:w="150" w:type="dxa"/>
-              <w:right w:w="150" w:type="dxa"/>
+              <w:top w:w="140" w:type="dxa"/>
+              <w:bottom w:w="140" w:type="dxa"/>
+              <w:left w:w="180" w:type="dxa"/>
+              <w:right w:w="180" w:type="dxa"/>
             </w:tcMar>
           </w:tcPr>
           <w:p>
@@ -914,10 +914,10 @@
             <w:tcW w:type="dxa" w:w="2329"/>
             <w:shd w:val="clear" w:color="auto" w:fill="F8F9FA"/>
             <w:tcMar>
-              <w:top w:w="120" w:type="dxa"/>
-              <w:bottom w:w="120" w:type="dxa"/>
-              <w:left w:w="150" w:type="dxa"/>
-              <w:right w:w="150" w:type="dxa"/>
+              <w:top w:w="140" w:type="dxa"/>
+              <w:bottom w:w="140" w:type="dxa"/>
+              <w:left w:w="180" w:type="dxa"/>
+              <w:right w:w="180" w:type="dxa"/>
             </w:tcMar>
           </w:tcPr>
           <w:p>
@@ -931,10 +931,10 @@
             <w:tcW w:type="dxa" w:w="2329"/>
             <w:shd w:val="clear" w:color="auto" w:fill="F8F9FA"/>
             <w:tcMar>
-              <w:top w:w="120" w:type="dxa"/>
-              <w:bottom w:w="120" w:type="dxa"/>
-              <w:left w:w="150" w:type="dxa"/>
-              <w:right w:w="150" w:type="dxa"/>
+              <w:top w:w="140" w:type="dxa"/>
+              <w:bottom w:w="140" w:type="dxa"/>
+              <w:left w:w="180" w:type="dxa"/>
+              <w:right w:w="180" w:type="dxa"/>
             </w:tcMar>
           </w:tcPr>
           <w:p>
@@ -951,15 +951,15 @@
             <w:tcW w:type="dxa" w:w="2329"/>
             <w:shd w:val="clear" w:color="auto" w:fill="F8F9FA"/>
             <w:tcMar>
-              <w:top w:w="120" w:type="dxa"/>
-              <w:bottom w:w="120" w:type="dxa"/>
-              <w:left w:w="150" w:type="dxa"/>
-              <w:right w:w="150" w:type="dxa"/>
+              <w:top w:w="140" w:type="dxa"/>
+              <w:bottom w:w="140" w:type="dxa"/>
+              <w:left w:w="180" w:type="dxa"/>
+              <w:right w:w="180" w:type="dxa"/>
             </w:tcMar>
           </w:tcPr>
           <w:p>
             <w:r>
-              <w:t>Điểm đánh giá chất lượng hoàn thiện từ người dùng thực tế tại Việt Nam.</w:t>
+              <w:t>Điểm đánh giá độ tin cậy từ người dùng thực tế tại hệ thống bán lẻ.</w:t>
             </w:r>
           </w:p>
         </w:tc>
@@ -979,13 +979,13 @@
         <w:br/>
       </w:r>
       <w:r>
-        <w:t>• Thư viện Học máy cốt lõi: Scikit-Learn 1.9+ (LinearRegression, RandomForestRegressor, StandardScaler, Pipeline, train_test_split).</w:t>
+        <w:t>• Thư viện Học máy: Scikit-Learn 1.9+ (LinearRegression, RandomForestRegressor, StandardScaler, Pipeline, train_test_split).</w:t>
         <w:br/>
-        <w:t>• Thư viện Đóng gói Model: Joblib 1.6+ (lưu trữ và tải tuần tự đối tượng Model Payload nhị phân .pkl).</w:t>
+        <w:t>• Đóng gói Mô hình: Joblib 1.6+ (lưu trữ và phục hồi mô hình nhị phân .pkl tối ưu tốc độ).</w:t>
         <w:br/>
-        <w:t>• Thư viện Tính toán khoa học: NumPy 2.5+ và Pandas 3.0+ (xử lý vector, ma trận khoảng cách và chuẩn hóa Z-score).</w:t>
+        <w:t>• Tính toán Ma trận &amp; Dữ liệu: NumPy 2.5+ và Pandas 3.0+ (xử lý vector hóa và khoảng cách Euclidean có trọng số).</w:t>
         <w:br/>
-        <w:t>• Web Framework: Flask 3.1+ (kết nối trực tiếp Model với Web Controller và REST API).</w:t>
+        <w:t>• Khung ứng dụng Web: Flask 3.1+ (kết nối trực quan hóa và API RESTful).</w:t>
       </w:r>
     </w:p>
     <w:p>
@@ -1005,11 +1005,11 @@
         <w:br/>
       </w:r>
       <w:r>
-        <w:t>Toàn bộ 225 mẫu laptop thực tế sau khi qua quy trình làm sạch (Data Cleaning) được đưa vào mô hình. Áp dụng hàm train_test_split với tỷ lệ test_size=0.2 (20%) và cố định random_state=42 để đảm bảo kết quả thực nghiệm hoàn toàn có thể tái lập:</w:t>
+        <w:t>Toàn bộ 225 mẫu laptop thực tế được phân tách ngẫu nhiên thành 2 tập độc lập bằng phương thức train_test_split với random_state=42 để đảm bảo tính tái lập hoàn toàn:</w:t>
         <w:br/>
-        <w:t>• Tập huấn luyện (Train set): 180 mẫu (80%) – dùng để khớp các tham số mô hình và huấn luyện các cây quyết định.</w:t>
+        <w:t>• Tập huấn luyện (Train Set): 180 mẫu (80%) – dùng để khớp tham số trọng số và cấu trúc cây quyết định.</w:t>
         <w:br/>
-        <w:t>• Tập kiểm thử (Test set): 45 mẫu (20%) – tập độc lập hoàn toàn không xuất hiện trong quá trình train, dùng đánh giá độ sai lệch khách quan.</w:t>
+        <w:t>• Tập kiểm thử (Test Set): 45 mẫu (20%) – tập độc lập hoàn toàn dùng để đo lường độ sai lệch khách quan.</w:t>
       </w:r>
     </w:p>
     <w:p>
@@ -1017,28 +1017,1214 @@
         <w:rPr>
           <w:b/>
         </w:rPr>
-        <w:t>2.2. Kiến trúc Pipeline Hồi quy Tuyến tính (Linear Regression with StandardScaler):</w:t>
+        <w:t>2.2. Chuẩn hóa Đặc trưng bằng StandardScaler:</w:t>
         <w:br/>
       </w:r>
       <w:r>
-        <w:t>Do các đặc trưng có khoảng giá trị rất chênh lệch (ví dụ cpu_score từ 3,000 đến 35,000, trong khi weight chỉ từ 1.0 đến 2.5 kg), nếu không chuẩn hóa, các thuộc tính có giá trị tuyệt đối lớn sẽ lấn át hoàn toàn gradient của các thuộc tính nhỏ. Do đó, mô hình Hồi quy Tuyến tính được đóng gói trong một Pipeline gồm 2 bước:</w:t>
-        <w:br/>
-        <w:t>1. Bước 1 ('scaler'): StandardScaler() thực hiện chuẩn hóa z = (x - u) / s đưa mọi thuộc tính về phân phối chuẩn có kỳ vọng 0 và phương sai 1.</w:t>
-        <w:br/>
-        <w:t>2. Bước 2 ('model'): LinearRegression() tối thiểu hóa tổng bình phương sai số (Ordinary Least Squares).</w:t>
+        <w:t>Do 9 đặc trưng đầu vào có đơn vị và thang đo chênh lệch rất lớn (ví dụ cpu_score từ 3,000 đến 35,000 trong khi weight chỉ từ 1.0 đến 2.5 kg), mô hình Hồi quy Tuyến tính bắt buộc phải được tiền xử lý bằng StandardScaler để đưa mọi thuộc tính về cùng một phân phối chuẩn.</w:t>
       </w:r>
+    </w:p>
+    <w:tbl>
+      <w:tblPr>
+        <w:tblW w:type="auto" w:w="0"/>
+        <w:jc w:val="center"/>
+        <w:tblLook w:firstColumn="1" w:firstRow="1" w:lastColumn="0" w:lastRow="0" w:noHBand="0" w:noVBand="1" w:val="04A0"/>
+      </w:tblPr>
+      <w:tblGrid>
+        <w:gridCol w:w="9317"/>
+      </w:tblGrid>
+      <w:tr>
+        <w:tc>
+          <w:tcPr>
+            <w:tcW w:type="dxa" w:w="9317"/>
+            <w:shd w:val="clear" w:color="auto" w:fill="F4F8FD"/>
+            <w:tcMar>
+              <w:top w:w="140" w:type="dxa"/>
+              <w:bottom w:w="140" w:type="dxa"/>
+              <w:left w:w="200" w:type="dxa"/>
+              <w:right w:w="200" w:type="dxa"/>
+            </w:tcMar>
+            <w:tcBorders>
+              <w:left w:val="single" w:sz="24" w:space="0" w:color="0D6EFD"/>
+              <w:top w:val="single" w:sz="4" w:space="0" w:color="DEE2E6"/>
+              <w:bottom w:val="single" w:sz="4" w:space="0" w:color="DEE2E6"/>
+              <w:right w:val="single" w:sz="4" w:space="0" w:color="DEE2E6"/>
+            </w:tcBorders>
+          </w:tcPr>
+          <w:p>
+            <w:pPr>
+              <w:spacing w:after="80"/>
+              <w:jc w:val="left"/>
+            </w:pPr>
+            <w:r>
+              <w:rPr>
+                <w:b/>
+                <w:color w:val="0D6EFD"/>
+                <w:sz w:val="22"/>
+              </w:rPr>
+              <w:t>✦ Công thức 1: Chuẩn hóa Z-Score trong StandardScaler</w:t>
+            </w:r>
+          </w:p>
+          <w:p>
+            <w:pPr>
+              <w:spacing w:before="160" w:after="160"/>
+              <w:jc w:val="center"/>
+            </w:pPr>
+            <m:oMathPara>
+              <m:oMath>
+                <m:r>
+                  <m:t>z</m:t>
+                </m:r>
+                <m:r>
+                  <m:t>=</m:t>
+                </m:r>
+                <m:f>
+                  <m:num>
+                    <m:r>
+                      <m:t>x - μ</m:t>
+                    </m:r>
+                  </m:num>
+                  <m:den>
+                    <m:r>
+                      <m:t>σ</m:t>
+                    </m:r>
+                  </m:den>
+                </m:f>
+                <m:r>
+                  <m:t>    với    μ = </m:t>
+                </m:r>
+                <m:f>
+                  <m:num>
+                    <m:r>
+                      <m:t>1</m:t>
+                    </m:r>
+                  </m:num>
+                  <m:den>
+                    <m:r>
+                      <m:t>N</m:t>
+                    </m:r>
+                  </m:den>
+                </m:f>
+                <m:nary>
+                  <m:naryPr>
+                    <m:chr m:val="∑"/>
+                    <m:limLoc m:val="undOvr"/>
+                  </m:naryPr>
+                  <m:sub>
+                    <m:r>
+                      <m:t>i=1</m:t>
+                    </m:r>
+                  </m:sub>
+                  <m:sup>
+                    <m:r>
+                      <m:t>N</m:t>
+                    </m:r>
+                  </m:sup>
+                  <m:e>
+                    <m:sSub>
+                      <m:e>
+                        <m:r>
+                          <m:t>x</m:t>
+                        </m:r>
+                      </m:e>
+                      <m:sub>
+                        <m:r>
+                          <m:t>i</m:t>
+                        </m:r>
+                      </m:sub>
+                    </m:sSub>
+                  </m:e>
+                </m:nary>
+                <m:r>
+                  <m:t>,    σ = </m:t>
+                </m:r>
+                <m:rad>
+                  <m:radPr>
+                    <m:degHide m:val="1"/>
+                  </m:radPr>
+                  <m:e>
+                    <m:f>
+                      <m:num>
+                        <m:r>
+                          <m:t>1</m:t>
+                        </m:r>
+                      </m:num>
+                      <m:den>
+                        <m:r>
+                          <m:t>N</m:t>
+                        </m:r>
+                      </m:den>
+                    </m:f>
+                    <m:nary>
+                      <m:naryPr>
+                        <m:chr m:val="∑"/>
+                        <m:limLoc m:val="undOvr"/>
+                      </m:naryPr>
+                      <m:sub>
+                        <m:r>
+                          <m:t>i=1</m:t>
+                        </m:r>
+                      </m:sub>
+                      <m:sup>
+                        <m:r>
+                          <m:t>N</m:t>
+                        </m:r>
+                      </m:sup>
+                      <m:e>
+                        <m:sSup>
+                          <m:e>
+                            <m:d>
+                              <m:dPr>
+                                <m:begChr m:val="("/>
+                                <m:endChr m:val=")"/>
+                              </m:dPr>
+                              <m:e>
+                                <m:sSub>
+                                  <m:e>
+                                    <m:r>
+                                      <m:t>x</m:t>
+                                    </m:r>
+                                  </m:e>
+                                  <m:sub>
+                                    <m:r>
+                                      <m:t>i</m:t>
+                                    </m:r>
+                                  </m:sub>
+                                </m:sSub>
+                                <m:r>
+                                  <m:t>-</m:t>
+                                </m:r>
+                                <m:r>
+                                  <m:t>μ</m:t>
+                                </m:r>
+                              </m:e>
+                            </m:d>
+                          </m:e>
+                          <m:sup>
+                            <m:r>
+                              <m:t>2</m:t>
+                            </m:r>
+                          </m:sup>
+                        </m:sSup>
+                      </m:e>
+                    </m:nary>
+                  </m:e>
+                </m:rad>
+              </m:oMath>
+            </m:oMathPara>
+          </w:p>
+          <w:p>
+            <w:pPr>
+              <w:spacing w:before="80" w:after="0" w:line="288" w:lineRule="auto"/>
+            </w:pPr>
+            <w:r>
+              <w:rPr>
+                <w:b/>
+                <w:i/>
+                <w:sz w:val="19"/>
+              </w:rPr>
+              <w:t>Trong đó:</w:t>
+              <w:br/>
+            </w:r>
+            <w:r>
+              <w:rPr>
+                <w:b/>
+                <w:sz w:val="19"/>
+              </w:rPr>
+              <w:t xml:space="preserve">  • z: </w:t>
+            </w:r>
+            <w:r>
+              <w:rPr>
+                <w:sz w:val="19"/>
+              </w:rPr>
+              <w:t>Giá trị thuộc tính sau khi chuẩn hóa (có kỳ vọng E[z] = 0 và phương sai Var(z) = 1)</w:t>
+              <w:br/>
+            </w:r>
+            <w:r>
+              <w:rPr>
+                <w:b/>
+                <w:sz w:val="19"/>
+              </w:rPr>
+              <w:t xml:space="preserve">  • x: </w:t>
+            </w:r>
+            <w:r>
+              <w:rPr>
+                <w:sz w:val="19"/>
+              </w:rPr>
+              <w:t>Giá trị thuộc tính gốc ban đầu của mẫu laptop (điểm CPU, RAM, pin...)</w:t>
+              <w:br/>
+            </w:r>
+            <w:r>
+              <w:rPr>
+                <w:b/>
+                <w:sz w:val="19"/>
+              </w:rPr>
+              <w:t xml:space="preserve">  • μ (Mu): </w:t>
+            </w:r>
+            <w:r>
+              <w:rPr>
+                <w:sz w:val="19"/>
+              </w:rPr>
+              <w:t>Giá trị trung bình số học (Mean) của đặc trưng tương ứng trên 180 mẫu tập huấn luyện</w:t>
+              <w:br/>
+            </w:r>
+            <w:r>
+              <w:rPr>
+                <w:b/>
+                <w:sz w:val="19"/>
+              </w:rPr>
+              <w:t xml:space="preserve">  • σ (Sigma): </w:t>
+            </w:r>
+            <w:r>
+              <w:rPr>
+                <w:sz w:val="19"/>
+              </w:rPr>
+              <w:t>Độ lệch chuẩn (Standard Deviation) đo mức độ phân tán của đặc trưng trên tập huấn luyện</w:t>
+              <w:br/>
+            </w:r>
+            <w:r>
+              <w:rPr>
+                <w:b/>
+                <w:sz w:val="19"/>
+              </w:rPr>
+              <w:t xml:space="preserve">  • N: </w:t>
+            </w:r>
+            <w:r>
+              <w:rPr>
+                <w:sz w:val="19"/>
+              </w:rPr>
+              <w:t>Số lượng mẫu trong tập huấn luyện (N = 180 mẫu)</w:t>
+              <w:br/>
+            </w:r>
+          </w:p>
+        </w:tc>
+      </w:tr>
+    </w:tbl>
+    <w:p>
+      <w:pPr>
+        <w:spacing w:after="120"/>
+      </w:pPr>
     </w:p>
     <w:p>
       <w:r>
         <w:rPr>
           <w:b/>
         </w:rPr>
-        <w:t>2.3. Cấu hình Mô hình Rừng Ngẫu nhiên (Random Forest Regressor):</w:t>
+        <w:t>2.3. Phương trình Hồi quy Tuyến tính Đa biến (Multivariate Linear Regression):</w:t>
         <w:br/>
       </w:r>
       <w:r>
-        <w:t>Mô hình Random Forest Regressor thuộc nhóm thuật toán Ensemble Learning (Ensemble Averaging) kết hợp 100 cây quyết định (n_estimators=100). Mỗi cây được xây dựng trên một tập con lấy mẫu ngẫu nhiên có hoàn lại (Bootstrap Sampling). Tại mỗi điểm chia nút, một tập con ngẫu nhiên các thuộc tính được lựa chọn để giảm phương sai và chống hiện tượng quá khớp (Overfitting). Random Forest có khả năng nắm bắt xuất sắc các mối quan hệ phi tuyến tính phức tạp giữa cấu hình phần cứng và giá bán.</w:t>
+        <w:t>Mô hình Hồi quy Tuyến tính dự đoán giá bán laptop bằng tổ hợp tuyến tính có trọng số của các đặc trưng chuẩn hóa:</w:t>
       </w:r>
+    </w:p>
+    <w:tbl>
+      <w:tblPr>
+        <w:tblW w:type="auto" w:w="0"/>
+        <w:jc w:val="center"/>
+        <w:tblLook w:firstColumn="1" w:firstRow="1" w:lastColumn="0" w:lastRow="0" w:noHBand="0" w:noVBand="1" w:val="04A0"/>
+      </w:tblPr>
+      <w:tblGrid>
+        <w:gridCol w:w="9317"/>
+      </w:tblGrid>
+      <w:tr>
+        <w:tc>
+          <w:tcPr>
+            <w:tcW w:type="dxa" w:w="9317"/>
+            <w:shd w:val="clear" w:color="auto" w:fill="F4F8FD"/>
+            <w:tcMar>
+              <w:top w:w="140" w:type="dxa"/>
+              <w:bottom w:w="140" w:type="dxa"/>
+              <w:left w:w="200" w:type="dxa"/>
+              <w:right w:w="200" w:type="dxa"/>
+            </w:tcMar>
+            <w:tcBorders>
+              <w:left w:val="single" w:sz="24" w:space="0" w:color="0D6EFD"/>
+              <w:top w:val="single" w:sz="4" w:space="0" w:color="DEE2E6"/>
+              <w:bottom w:val="single" w:sz="4" w:space="0" w:color="DEE2E6"/>
+              <w:right w:val="single" w:sz="4" w:space="0" w:color="DEE2E6"/>
+            </w:tcBorders>
+          </w:tcPr>
+          <w:p>
+            <w:pPr>
+              <w:spacing w:after="80"/>
+              <w:jc w:val="left"/>
+            </w:pPr>
+            <w:r>
+              <w:rPr>
+                <w:b/>
+                <w:color w:val="0D6EFD"/>
+                <w:sz w:val="22"/>
+              </w:rPr>
+              <w:t>✦ Công thức 2: Phương trình Hồi quy Tuyến tính Đa biến</w:t>
+            </w:r>
+          </w:p>
+          <w:p>
+            <w:pPr>
+              <w:spacing w:before="160" w:after="160"/>
+              <w:jc w:val="center"/>
+            </w:pPr>
+            <m:oMathPara>
+              <m:oMath>
+                <m:sSup>
+                  <m:e>
+                    <m:r>
+                      <m:t>y</m:t>
+                    </m:r>
+                  </m:e>
+                  <m:sup>
+                    <m:r>
+                      <m:t>^</m:t>
+                    </m:r>
+                  </m:sup>
+                </m:sSup>
+                <m:r>
+                  <m:t>=</m:t>
+                </m:r>
+                <m:sSub>
+                  <m:e>
+                    <m:r>
+                      <m:t>w</m:t>
+                    </m:r>
+                  </m:e>
+                  <m:sub>
+                    <m:r>
+                      <m:t>0</m:t>
+                    </m:r>
+                  </m:sub>
+                </m:sSub>
+                <m:r>
+                  <m:t>+</m:t>
+                </m:r>
+                <m:sSub>
+                  <m:e>
+                    <m:r>
+                      <m:t>w</m:t>
+                    </m:r>
+                  </m:e>
+                  <m:sub>
+                    <m:r>
+                      <m:t>1</m:t>
+                    </m:r>
+                  </m:sub>
+                </m:sSub>
+                <m:sSub>
+                  <m:e>
+                    <m:r>
+                      <m:t>z</m:t>
+                    </m:r>
+                  </m:e>
+                  <m:sub>
+                    <m:r>
+                      <m:t>1</m:t>
+                    </m:r>
+                  </m:sub>
+                </m:sSub>
+                <m:r>
+                  <m:t>+</m:t>
+                </m:r>
+                <m:sSub>
+                  <m:e>
+                    <m:r>
+                      <m:t>w</m:t>
+                    </m:r>
+                  </m:e>
+                  <m:sub>
+                    <m:r>
+                      <m:t>2</m:t>
+                    </m:r>
+                  </m:sub>
+                </m:sSub>
+                <m:sSub>
+                  <m:e>
+                    <m:r>
+                      <m:t>z</m:t>
+                    </m:r>
+                  </m:e>
+                  <m:sub>
+                    <m:r>
+                      <m:t>2</m:t>
+                    </m:r>
+                  </m:sub>
+                </m:sSub>
+                <m:r>
+                  <m:t>+</m:t>
+                </m:r>
+                <m:r>
+                  <m:t>⋯</m:t>
+                </m:r>
+                <m:r>
+                  <m:t>+</m:t>
+                </m:r>
+                <m:sSub>
+                  <m:e>
+                    <m:r>
+                      <m:t>w</m:t>
+                    </m:r>
+                  </m:e>
+                  <m:sub>
+                    <m:r>
+                      <m:t>p</m:t>
+                    </m:r>
+                  </m:sub>
+                </m:sSub>
+                <m:sSub>
+                  <m:e>
+                    <m:r>
+                      <m:t>z</m:t>
+                    </m:r>
+                  </m:e>
+                  <m:sub>
+                    <m:r>
+                      <m:t>p</m:t>
+                    </m:r>
+                  </m:sub>
+                </m:sSub>
+                <m:r>
+                  <m:t>=</m:t>
+                </m:r>
+                <m:sSub>
+                  <m:e>
+                    <m:r>
+                      <m:t>w</m:t>
+                    </m:r>
+                  </m:e>
+                  <m:sub>
+                    <m:r>
+                      <m:t>0</m:t>
+                    </m:r>
+                  </m:sub>
+                </m:sSub>
+                <m:r>
+                  <m:t>+</m:t>
+                </m:r>
+                <m:nary>
+                  <m:naryPr>
+                    <m:chr m:val="∑"/>
+                    <m:limLoc m:val="undOvr"/>
+                  </m:naryPr>
+                  <m:sub>
+                    <m:r>
+                      <m:t>j=1</m:t>
+                    </m:r>
+                  </m:sub>
+                  <m:sup>
+                    <m:r>
+                      <m:t>p</m:t>
+                    </m:r>
+                  </m:sup>
+                  <m:e>
+                    <m:sSub>
+                      <m:e>
+                        <m:r>
+                          <m:t>w</m:t>
+                        </m:r>
+                      </m:e>
+                      <m:sub>
+                        <m:r>
+                          <m:t>j</m:t>
+                        </m:r>
+                      </m:sub>
+                    </m:sSub>
+                    <m:sSub>
+                      <m:e>
+                        <m:r>
+                          <m:t>z</m:t>
+                        </m:r>
+                      </m:e>
+                      <m:sub>
+                        <m:r>
+                          <m:t>j</m:t>
+                        </m:r>
+                      </m:sub>
+                    </m:sSub>
+                  </m:e>
+                </m:nary>
+                <m:r>
+                  <m:t>=</m:t>
+                </m:r>
+                <m:sSup>
+                  <m:e>
+                    <m:r>
+                      <m:t>w</m:t>
+                    </m:r>
+                  </m:e>
+                  <m:sup>
+                    <m:r>
+                      <m:t>T</m:t>
+                    </m:r>
+                  </m:sup>
+                </m:sSup>
+                <m:r>
+                  <m:t>z</m:t>
+                </m:r>
+                <m:r>
+                  <m:t>+</m:t>
+                </m:r>
+                <m:sSub>
+                  <m:e>
+                    <m:r>
+                      <m:t>w</m:t>
+                    </m:r>
+                  </m:e>
+                  <m:sub>
+                    <m:r>
+                      <m:t>0</m:t>
+                    </m:r>
+                  </m:sub>
+                </m:sSub>
+              </m:oMath>
+            </m:oMathPara>
+          </w:p>
+          <w:p>
+            <w:pPr>
+              <w:spacing w:before="80" w:after="0" w:line="288" w:lineRule="auto"/>
+            </w:pPr>
+            <w:r>
+              <w:rPr>
+                <w:b/>
+                <w:i/>
+                <w:sz w:val="19"/>
+              </w:rPr>
+              <w:t>Trong đó:</w:t>
+              <w:br/>
+            </w:r>
+            <w:r>
+              <w:rPr>
+                <w:b/>
+                <w:sz w:val="19"/>
+              </w:rPr>
+              <w:t xml:space="preserve">  • ŷ (y-hat): </w:t>
+            </w:r>
+            <w:r>
+              <w:rPr>
+                <w:sz w:val="19"/>
+              </w:rPr>
+              <w:t>Mức giá laptop dự đoán ước tính (đơn vị: VNĐ)</w:t>
+              <w:br/>
+            </w:r>
+            <w:r>
+              <w:rPr>
+                <w:b/>
+                <w:sz w:val="19"/>
+              </w:rPr>
+              <w:t xml:space="preserve">  • w₀: </w:t>
+            </w:r>
+            <w:r>
+              <w:rPr>
+                <w:sz w:val="19"/>
+              </w:rPr>
+              <w:t>Hệ số tự do (Bias / Intercept)</w:t>
+              <w:br/>
+            </w:r>
+            <w:r>
+              <w:rPr>
+                <w:b/>
+                <w:sz w:val="19"/>
+              </w:rPr>
+              <w:t xml:space="preserve">  • wⱼ: </w:t>
+            </w:r>
+            <w:r>
+              <w:rPr>
+                <w:sz w:val="19"/>
+              </w:rPr>
+              <w:t>Hệ số góc trọng số của đặc trưng thứ j (với p = 9 đặc trưng)</w:t>
+              <w:br/>
+            </w:r>
+            <w:r>
+              <w:rPr>
+                <w:b/>
+                <w:sz w:val="19"/>
+              </w:rPr>
+              <w:t xml:space="preserve">  • zⱼ: </w:t>
+            </w:r>
+            <w:r>
+              <w:rPr>
+                <w:sz w:val="19"/>
+              </w:rPr>
+              <w:t>Giá trị của đặc trưng thứ j sau khi chuẩn hóa Z-score</w:t>
+              <w:br/>
+            </w:r>
+            <w:r>
+              <w:rPr>
+                <w:b/>
+                <w:sz w:val="19"/>
+              </w:rPr>
+              <w:t xml:space="preserve">  • w^T z: </w:t>
+            </w:r>
+            <w:r>
+              <w:rPr>
+                <w:sz w:val="19"/>
+              </w:rPr>
+              <w:t>Tích vô hướng giữa vector trọng số w và vector đặc trưng z</w:t>
+              <w:br/>
+            </w:r>
+          </w:p>
+        </w:tc>
+      </w:tr>
+    </w:tbl>
+    <w:p>
+      <w:pPr>
+        <w:spacing w:after="120"/>
+      </w:pPr>
+    </w:p>
+    <w:p>
+      <w:r>
+        <w:rPr>
+          <w:b/>
+        </w:rPr>
+        <w:t>2.4. Hàm Mất mát Bình phương Tối thiểu OLS (Ordinary Least Squares):</w:t>
+        <w:br/>
+      </w:r>
+      <w:r>
+        <w:t>Mô hình tìm kiếm bộ trọng số tối ưu (w, w₀) bằng cách cực tiểu hóa hàm tổn thất bình phương trung bình:</w:t>
+      </w:r>
+    </w:p>
+    <w:tbl>
+      <w:tblPr>
+        <w:tblW w:type="auto" w:w="0"/>
+        <w:jc w:val="center"/>
+        <w:tblLook w:firstColumn="1" w:firstRow="1" w:lastColumn="0" w:lastRow="0" w:noHBand="0" w:noVBand="1" w:val="04A0"/>
+      </w:tblPr>
+      <w:tblGrid>
+        <w:gridCol w:w="9317"/>
+      </w:tblGrid>
+      <w:tr>
+        <w:tc>
+          <w:tcPr>
+            <w:tcW w:type="dxa" w:w="9317"/>
+            <w:shd w:val="clear" w:color="auto" w:fill="F4F8FD"/>
+            <w:tcMar>
+              <w:top w:w="140" w:type="dxa"/>
+              <w:bottom w:w="140" w:type="dxa"/>
+              <w:left w:w="200" w:type="dxa"/>
+              <w:right w:w="200" w:type="dxa"/>
+            </w:tcMar>
+            <w:tcBorders>
+              <w:left w:val="single" w:sz="24" w:space="0" w:color="0D6EFD"/>
+              <w:top w:val="single" w:sz="4" w:space="0" w:color="DEE2E6"/>
+              <w:bottom w:val="single" w:sz="4" w:space="0" w:color="DEE2E6"/>
+              <w:right w:val="single" w:sz="4" w:space="0" w:color="DEE2E6"/>
+            </w:tcBorders>
+          </w:tcPr>
+          <w:p>
+            <w:pPr>
+              <w:spacing w:after="80"/>
+              <w:jc w:val="left"/>
+            </w:pPr>
+            <w:r>
+              <w:rPr>
+                <w:b/>
+                <w:color w:val="0D6EFD"/>
+                <w:sz w:val="22"/>
+              </w:rPr>
+              <w:t>✦ Công thức 3: Hàm Mất mát Bình phương Tối thiểu (OLS Loss Function)</w:t>
+            </w:r>
+          </w:p>
+          <w:p>
+            <w:pPr>
+              <w:spacing w:before="160" w:after="160"/>
+              <w:jc w:val="center"/>
+            </w:pPr>
+            <m:oMathPara>
+              <m:oMath>
+                <m:r>
+                  <m:t>J(w,</m:t>
+                </m:r>
+                <m:sSub>
+                  <m:e>
+                    <m:r>
+                      <m:t>w</m:t>
+                    </m:r>
+                  </m:e>
+                  <m:sub>
+                    <m:r>
+                      <m:t>0</m:t>
+                    </m:r>
+                  </m:sub>
+                </m:sSub>
+                <m:r>
+                  <m:t>)=</m:t>
+                </m:r>
+                <m:f>
+                  <m:num>
+                    <m:r>
+                      <m:t>1</m:t>
+                    </m:r>
+                  </m:num>
+                  <m:den>
+                    <m:r>
+                      <m:t>2N</m:t>
+                    </m:r>
+                  </m:den>
+                </m:f>
+                <m:nary>
+                  <m:naryPr>
+                    <m:chr m:val="∑"/>
+                    <m:limLoc m:val="undOvr"/>
+                  </m:naryPr>
+                  <m:sub>
+                    <m:r>
+                      <m:t>i=1</m:t>
+                    </m:r>
+                  </m:sub>
+                  <m:sup>
+                    <m:r>
+                      <m:t>N</m:t>
+                    </m:r>
+                  </m:sup>
+                  <m:e>
+                    <m:sSup>
+                      <m:e>
+                        <m:d>
+                          <m:dPr>
+                            <m:begChr m:val="("/>
+                            <m:endChr m:val=")"/>
+                          </m:dPr>
+                          <m:e>
+                            <m:sSup>
+                              <m:e>
+                                <m:r>
+                                  <m:t>y</m:t>
+                                </m:r>
+                              </m:e>
+                              <m:sup>
+                                <m:r>
+                                  <m:t>^</m:t>
+                                </m:r>
+                              </m:sup>
+                            </m:sSup>
+                            <m:sSub>
+                              <m:e/>
+                              <m:sub>
+                                <m:r>
+                                  <m:t>i</m:t>
+                                </m:r>
+                              </m:sub>
+                            </m:sSub>
+                            <m:r>
+                              <m:t>-</m:t>
+                            </m:r>
+                            <m:sSub>
+                              <m:e>
+                                <m:r>
+                                  <m:t>y</m:t>
+                                </m:r>
+                              </m:e>
+                              <m:sub>
+                                <m:r>
+                                  <m:t>i</m:t>
+                                </m:r>
+                              </m:sub>
+                            </m:sSub>
+                          </m:e>
+                        </m:d>
+                      </m:e>
+                      <m:sup>
+                        <m:r>
+                          <m:t>2</m:t>
+                        </m:r>
+                      </m:sup>
+                    </m:sSup>
+                  </m:e>
+                </m:nary>
+                <m:r>
+                  <m:t>=</m:t>
+                </m:r>
+                <m:f>
+                  <m:num>
+                    <m:r>
+                      <m:t>1</m:t>
+                    </m:r>
+                  </m:num>
+                  <m:den>
+                    <m:r>
+                      <m:t>2N</m:t>
+                    </m:r>
+                  </m:den>
+                </m:f>
+                <m:nary>
+                  <m:naryPr>
+                    <m:chr m:val="∑"/>
+                    <m:limLoc m:val="undOvr"/>
+                  </m:naryPr>
+                  <m:sub>
+                    <m:r>
+                      <m:t>i=1</m:t>
+                    </m:r>
+                  </m:sub>
+                  <m:sup>
+                    <m:r>
+                      <m:t>N</m:t>
+                    </m:r>
+                  </m:sup>
+                  <m:e>
+                    <m:sSup>
+                      <m:e>
+                        <m:d>
+                          <m:dPr>
+                            <m:begChr m:val="("/>
+                            <m:endChr m:val=")"/>
+                          </m:dPr>
+                          <m:e>
+                            <m:sSup>
+                              <m:e>
+                                <m:r>
+                                  <m:t>w</m:t>
+                                </m:r>
+                              </m:e>
+                              <m:sup>
+                                <m:r>
+                                  <m:t>T</m:t>
+                                </m:r>
+                              </m:sup>
+                            </m:sSup>
+                            <m:sSub>
+                              <m:e>
+                                <m:r>
+                                  <m:t>z</m:t>
+                                </m:r>
+                              </m:e>
+                              <m:sub>
+                                <m:r>
+                                  <m:t>i</m:t>
+                                </m:r>
+                              </m:sub>
+                            </m:sSub>
+                            <m:r>
+                              <m:t>+</m:t>
+                            </m:r>
+                            <m:sSub>
+                              <m:e>
+                                <m:r>
+                                  <m:t>w</m:t>
+                                </m:r>
+                              </m:e>
+                              <m:sub>
+                                <m:r>
+                                  <m:t>0</m:t>
+                                </m:r>
+                              </m:sub>
+                            </m:sSub>
+                            <m:r>
+                              <m:t>-</m:t>
+                            </m:r>
+                            <m:sSub>
+                              <m:e>
+                                <m:r>
+                                  <m:t>y</m:t>
+                                </m:r>
+                              </m:e>
+                              <m:sub>
+                                <m:r>
+                                  <m:t>i</m:t>
+                                </m:r>
+                              </m:sub>
+                            </m:sSub>
+                          </m:e>
+                        </m:d>
+                      </m:e>
+                      <m:sup>
+                        <m:r>
+                          <m:t>2</m:t>
+                        </m:r>
+                      </m:sup>
+                    </m:sSup>
+                  </m:e>
+                </m:nary>
+              </m:oMath>
+            </m:oMathPara>
+          </w:p>
+          <w:p>
+            <w:pPr>
+              <w:spacing w:before="80" w:after="0" w:line="288" w:lineRule="auto"/>
+            </w:pPr>
+            <w:r>
+              <w:rPr>
+                <w:b/>
+                <w:i/>
+                <w:sz w:val="19"/>
+              </w:rPr>
+              <w:t>Trong đó:</w:t>
+              <w:br/>
+            </w:r>
+            <w:r>
+              <w:rPr>
+                <w:b/>
+                <w:sz w:val="19"/>
+              </w:rPr>
+              <w:t xml:space="preserve">  • J(w, w₀): </w:t>
+            </w:r>
+            <w:r>
+              <w:rPr>
+                <w:sz w:val="19"/>
+              </w:rPr>
+              <w:t>Giá trị hàm mất mát cần tối thiểu hóa</w:t>
+              <w:br/>
+            </w:r>
+            <w:r>
+              <w:rPr>
+                <w:b/>
+                <w:sz w:val="19"/>
+              </w:rPr>
+              <w:t xml:space="preserve">  • yᵢ: </w:t>
+            </w:r>
+            <w:r>
+              <w:rPr>
+                <w:sz w:val="19"/>
+              </w:rPr>
+              <w:t>Giá bán thực tế của laptop thứ i trong tập dữ liệu</w:t>
+              <w:br/>
+            </w:r>
+            <w:r>
+              <w:rPr>
+                <w:b/>
+                <w:sz w:val="19"/>
+              </w:rPr>
+              <w:t xml:space="preserve">  • ŷᵢ: </w:t>
+            </w:r>
+            <w:r>
+              <w:rPr>
+                <w:sz w:val="19"/>
+              </w:rPr>
+              <w:t>Giá dự đoán tương ứng do mô hình tuyến tính ước tính</w:t>
+              <w:br/>
+            </w:r>
+            <w:r>
+              <w:rPr>
+                <w:b/>
+                <w:sz w:val="19"/>
+              </w:rPr>
+              <w:t xml:space="preserve">  • N: </w:t>
+            </w:r>
+            <w:r>
+              <w:rPr>
+                <w:sz w:val="19"/>
+              </w:rPr>
+              <w:t>Số lượng mẫu trong tập huấn luyện (N = 180)</w:t>
+              <w:br/>
+            </w:r>
+          </w:p>
+        </w:tc>
+      </w:tr>
+    </w:tbl>
+    <w:p>
+      <w:pPr>
+        <w:spacing w:after="120"/>
+      </w:pPr>
+    </w:p>
+    <w:p>
+      <w:r>
+        <w:rPr>
+          <w:b/>
+        </w:rPr>
+        <w:t>2.5. Mô hình Rừng Ngẫu nhiên (Random Forest Regressor):</w:t>
+        <w:br/>
+      </w:r>
+      <w:r>
+        <w:t>Mô hình Random Forest kết hợp 100 cây quyết định độc lập (B = 100). Giá trị dự đoán cuối cùng là trung bình cộng dự đoán từ toàn bộ quần thể cây để giảm thiểu tối đa phương sai (Variance Reduction):</w:t>
+      </w:r>
+    </w:p>
+    <w:tbl>
+      <w:tblPr>
+        <w:tblW w:type="auto" w:w="0"/>
+        <w:jc w:val="center"/>
+        <w:tblLook w:firstColumn="1" w:firstRow="1" w:lastColumn="0" w:lastRow="0" w:noHBand="0" w:noVBand="1" w:val="04A0"/>
+      </w:tblPr>
+      <w:tblGrid>
+        <w:gridCol w:w="9317"/>
+      </w:tblGrid>
+      <w:tr>
+        <w:tc>
+          <w:tcPr>
+            <w:tcW w:type="dxa" w:w="9317"/>
+            <w:shd w:val="clear" w:color="auto" w:fill="F4F8FD"/>
+            <w:tcMar>
+              <w:top w:w="140" w:type="dxa"/>
+              <w:bottom w:w="140" w:type="dxa"/>
+              <w:left w:w="200" w:type="dxa"/>
+              <w:right w:w="200" w:type="dxa"/>
+            </w:tcMar>
+            <w:tcBorders>
+              <w:left w:val="single" w:sz="24" w:space="0" w:color="0D6EFD"/>
+              <w:top w:val="single" w:sz="4" w:space="0" w:color="DEE2E6"/>
+              <w:bottom w:val="single" w:sz="4" w:space="0" w:color="DEE2E6"/>
+              <w:right w:val="single" w:sz="4" w:space="0" w:color="DEE2E6"/>
+            </w:tcBorders>
+          </w:tcPr>
+          <w:p>
+            <w:pPr>
+              <w:spacing w:after="80"/>
+              <w:jc w:val="left"/>
+            </w:pPr>
+            <w:r>
+              <w:rPr>
+                <w:b/>
+                <w:color w:val="0D6EFD"/>
+                <w:sz w:val="22"/>
+              </w:rPr>
+              <w:t>✦ Công thức 4: Dự đoán Quần thể Rừng Ngẫu nhiên (Ensemble Averaging)</w:t>
+            </w:r>
+          </w:p>
+          <w:p>
+            <w:pPr>
+              <w:spacing w:before="160" w:after="160"/>
+              <w:jc w:val="center"/>
+            </w:pPr>
+            <m:oMathPara>
+              <m:oMath>
+                <m:sSubSup>
+                  <m:e>
+                    <m:r>
+                      <m:t>y</m:t>
+                    </m:r>
+                  </m:e>
+                  <m:sub>
+                    <m:r>
+                      <m:t>RF</m:t>
+                    </m:r>
+                  </m:sub>
+                  <m:sup>
+                    <m:r>
+                      <m:t>^</m:t>
+                    </m:r>
+                  </m:sup>
+                </m:sSubSup>
+                <m:r>
+                  <m:t>=</m:t>
+                </m:r>
+                <m:f>
+                  <m:num>
+                    <m:r>
+                      <m:t>1</m:t>
+                    </m:r>
+                  </m:num>
+                  <m:den>
+                    <m:r>
+                      <m:t>B</m:t>
+                    </m:r>
+                  </m:den>
+                </m:f>
+                <m:nary>
+                  <m:naryPr>
+                    <m:chr m:val="∑"/>
+                    <m:limLoc m:val="undOvr"/>
+                  </m:naryPr>
+                  <m:sub>
+                    <m:r>
+                      <m:t>b=1</m:t>
+                    </m:r>
+                  </m:sub>
+                  <m:sup>
+                    <m:r>
+                      <m:t>B</m:t>
+                    </m:r>
+                  </m:sup>
+                  <m:e>
+                    <m:sSub>
+                      <m:e>
+                        <m:r>
+                          <m:t>T</m:t>
+                        </m:r>
+                      </m:e>
+                      <m:sub>
+                        <m:r>
+                          <m:t>b</m:t>
+                        </m:r>
+                      </m:sub>
+                    </m:sSub>
+                    <m:d>
+                      <m:dPr>
+                        <m:begChr m:val="("/>
+                        <m:endChr m:val=")"/>
+                      </m:dPr>
+                      <m:e>
+                        <m:r>
+                          <m:t>x</m:t>
+                        </m:r>
+                      </m:e>
+                    </m:d>
+                  </m:e>
+                </m:nary>
+              </m:oMath>
+            </m:oMathPara>
+          </w:p>
+          <w:p>
+            <w:pPr>
+              <w:spacing w:before="80" w:after="0" w:line="288" w:lineRule="auto"/>
+            </w:pPr>
+            <w:r>
+              <w:rPr>
+                <w:b/>
+                <w:i/>
+                <w:sz w:val="19"/>
+              </w:rPr>
+              <w:t>Trong đó:</w:t>
+              <w:br/>
+            </w:r>
+            <w:r>
+              <w:rPr>
+                <w:b/>
+                <w:sz w:val="19"/>
+              </w:rPr>
+              <w:t xml:space="preserve">  • ŷ_RF: </w:t>
+            </w:r>
+            <w:r>
+              <w:rPr>
+                <w:sz w:val="19"/>
+              </w:rPr>
+              <w:t>Giá dự đoán tổng hợp từ mô hình Random Forest</w:t>
+              <w:br/>
+            </w:r>
+            <w:r>
+              <w:rPr>
+                <w:b/>
+                <w:sz w:val="19"/>
+              </w:rPr>
+              <w:t xml:space="preserve">  • B: </w:t>
+            </w:r>
+            <w:r>
+              <w:rPr>
+                <w:sz w:val="19"/>
+              </w:rPr>
+              <w:t>Tổng số cây quyết định trong mô hình (B = 100 cây, n_estimators=100)</w:t>
+              <w:br/>
+            </w:r>
+            <w:r>
+              <w:rPr>
+                <w:b/>
+                <w:sz w:val="19"/>
+              </w:rPr>
+              <w:t xml:space="preserve">  • T_b(x): </w:t>
+            </w:r>
+            <w:r>
+              <w:rPr>
+                <w:sz w:val="19"/>
+              </w:rPr>
+              <w:t>Giá dự đoán từ cây quyết định thứ b xây dựng trên tập mẫu con Bootstrap</w:t>
+              <w:br/>
+            </w:r>
+            <w:r>
+              <w:rPr>
+                <w:b/>
+                <w:sz w:val="19"/>
+              </w:rPr>
+              <w:t xml:space="preserve">  • x: </w:t>
+            </w:r>
+            <w:r>
+              <w:rPr>
+                <w:sz w:val="19"/>
+              </w:rPr>
+              <w:t>Vector 9 thông số kỹ thuật gốc của laptop</w:t>
+              <w:br/>
+            </w:r>
+          </w:p>
+        </w:tc>
+      </w:tr>
+    </w:tbl>
+    <w:p>
+      <w:pPr>
+        <w:spacing w:after="120"/>
+      </w:pPr>
     </w:p>
     <w:p>
       <w:pPr>
@@ -1053,15 +2239,715 @@
         <w:rPr>
           <w:b/>
         </w:rPr>
-        <w:t>3.1. Các thang đo đánh giá chất lượng mô hình hồi quy:</w:t>
+        <w:t>3.1. Các Thang đo Đánh giá Hiệu năng Mô hình Hồi quy:</w:t>
         <w:br/>
       </w:r>
       <w:r>
-        <w:t>• MAE (Mean Absolute Error): Độ lệch tuyệt đối trung bình giữa giá dự đoán và giá niêm yết thực tế (tính theo VNĐ).</w:t>
+        <w:t>Để đánh giá toàn diện và khách quan, hệ thống thiết lập 3 tiêu chuẩn đo lường sai số chuẩn mực quốc tế:</w:t>
+      </w:r>
+    </w:p>
+    <w:tbl>
+      <w:tblPr>
+        <w:tblW w:type="auto" w:w="0"/>
+        <w:jc w:val="center"/>
+        <w:tblLook w:firstColumn="1" w:firstRow="1" w:lastColumn="0" w:lastRow="0" w:noHBand="0" w:noVBand="1" w:val="04A0"/>
+      </w:tblPr>
+      <w:tblGrid>
+        <w:gridCol w:w="9317"/>
+      </w:tblGrid>
+      <w:tr>
+        <w:tc>
+          <w:tcPr>
+            <w:tcW w:type="dxa" w:w="9317"/>
+            <w:shd w:val="clear" w:color="auto" w:fill="F4F8FD"/>
+            <w:tcMar>
+              <w:top w:w="140" w:type="dxa"/>
+              <w:bottom w:w="140" w:type="dxa"/>
+              <w:left w:w="200" w:type="dxa"/>
+              <w:right w:w="200" w:type="dxa"/>
+            </w:tcMar>
+            <w:tcBorders>
+              <w:left w:val="single" w:sz="24" w:space="0" w:color="0D6EFD"/>
+              <w:top w:val="single" w:sz="4" w:space="0" w:color="DEE2E6"/>
+              <w:bottom w:val="single" w:sz="4" w:space="0" w:color="DEE2E6"/>
+              <w:right w:val="single" w:sz="4" w:space="0" w:color="DEE2E6"/>
+            </w:tcBorders>
+          </w:tcPr>
+          <w:p>
+            <w:pPr>
+              <w:spacing w:after="80"/>
+              <w:jc w:val="left"/>
+            </w:pPr>
+            <w:r>
+              <w:rPr>
+                <w:b/>
+                <w:color w:val="0D6EFD"/>
+                <w:sz w:val="22"/>
+              </w:rPr>
+              <w:t>✦ Công thức 5: Sai số Tuyệt đối Trung bình (Mean Absolute Error - MAE)</w:t>
+            </w:r>
+          </w:p>
+          <w:p>
+            <w:pPr>
+              <w:spacing w:before="160" w:after="160"/>
+              <w:jc w:val="center"/>
+            </w:pPr>
+            <m:oMathPara>
+              <m:oMath>
+                <m:r>
+                  <m:t>MAE = </m:t>
+                </m:r>
+                <m:f>
+                  <m:num>
+                    <m:r>
+                      <m:t>1</m:t>
+                    </m:r>
+                  </m:num>
+                  <m:den>
+                    <m:r>
+                      <m:t>n</m:t>
+                    </m:r>
+                  </m:den>
+                </m:f>
+                <m:nary>
+                  <m:naryPr>
+                    <m:chr m:val="∑"/>
+                    <m:limLoc m:val="undOvr"/>
+                  </m:naryPr>
+                  <m:sub>
+                    <m:r>
+                      <m:t>i=1</m:t>
+                    </m:r>
+                  </m:sub>
+                  <m:sup>
+                    <m:r>
+                      <m:t>n</m:t>
+                    </m:r>
+                  </m:sup>
+                  <m:e>
+                    <m:d>
+                      <m:dPr>
+                        <m:begChr m:val="|"/>
+                        <m:endChr m:val="|"/>
+                      </m:dPr>
+                      <m:e>
+                        <m:sSub>
+                          <m:e>
+                            <m:r>
+                              <m:t>y</m:t>
+                            </m:r>
+                          </m:e>
+                          <m:sub>
+                            <m:r>
+                              <m:t>i</m:t>
+                            </m:r>
+                          </m:sub>
+                        </m:sSub>
+                        <m:r>
+                          <m:t>-</m:t>
+                        </m:r>
+                        <m:sSubSup>
+                          <m:e>
+                            <m:r>
+                              <m:t>y</m:t>
+                            </m:r>
+                          </m:e>
+                          <m:sub>
+                            <m:r>
+                              <m:t>i</m:t>
+                            </m:r>
+                          </m:sub>
+                          <m:sup>
+                            <m:r>
+                              <m:t>^</m:t>
+                            </m:r>
+                          </m:sup>
+                        </m:sSubSup>
+                      </m:e>
+                    </m:d>
+                  </m:e>
+                </m:nary>
+              </m:oMath>
+            </m:oMathPara>
+          </w:p>
+          <w:p>
+            <w:pPr>
+              <w:spacing w:before="80" w:after="0" w:line="288" w:lineRule="auto"/>
+            </w:pPr>
+            <w:r>
+              <w:rPr>
+                <w:b/>
+                <w:i/>
+                <w:sz w:val="19"/>
+              </w:rPr>
+              <w:t>Trong đó:</w:t>
+              <w:br/>
+            </w:r>
+            <w:r>
+              <w:rPr>
+                <w:b/>
+                <w:sz w:val="19"/>
+              </w:rPr>
+              <w:t xml:space="preserve">  • MAE: </w:t>
+            </w:r>
+            <w:r>
+              <w:rPr>
+                <w:sz w:val="19"/>
+              </w:rPr>
+              <w:t>Độ lệch tuyệt đối trung bình giữa giá dự đoán và giá niêm yết thực tế (đơn vị: VNĐ)</w:t>
+              <w:br/>
+            </w:r>
+            <w:r>
+              <w:rPr>
+                <w:b/>
+                <w:sz w:val="19"/>
+              </w:rPr>
+              <w:t xml:space="preserve">  • n: </w:t>
+            </w:r>
+            <w:r>
+              <w:rPr>
+                <w:sz w:val="19"/>
+              </w:rPr>
+              <w:t>Số lượng mẫu trong tập kiểm thử (n = 45 mẫu Test)</w:t>
+              <w:br/>
+            </w:r>
+            <w:r>
+              <w:rPr>
+                <w:b/>
+                <w:sz w:val="19"/>
+              </w:rPr>
+              <w:t xml:space="preserve">  • yᵢ: </w:t>
+            </w:r>
+            <w:r>
+              <w:rPr>
+                <w:sz w:val="19"/>
+              </w:rPr>
+              <w:t>Giá bán niêm yết thực tế của laptop thứ i</w:t>
+              <w:br/>
+            </w:r>
+            <w:r>
+              <w:rPr>
+                <w:b/>
+                <w:sz w:val="19"/>
+              </w:rPr>
+              <w:t xml:space="preserve">  • ŷᵢ: </w:t>
+            </w:r>
+            <w:r>
+              <w:rPr>
+                <w:sz w:val="19"/>
+              </w:rPr>
+              <w:t>Giá ước tính do mô hình tính toán cho laptop thứ i</w:t>
+              <w:br/>
+            </w:r>
+          </w:p>
+        </w:tc>
+      </w:tr>
+    </w:tbl>
+    <w:p>
+      <w:pPr>
+        <w:spacing w:after="120"/>
+      </w:pPr>
+    </w:p>
+    <w:tbl>
+      <w:tblPr>
+        <w:tblW w:type="auto" w:w="0"/>
+        <w:jc w:val="center"/>
+        <w:tblLook w:firstColumn="1" w:firstRow="1" w:lastColumn="0" w:lastRow="0" w:noHBand="0" w:noVBand="1" w:val="04A0"/>
+      </w:tblPr>
+      <w:tblGrid>
+        <w:gridCol w:w="9317"/>
+      </w:tblGrid>
+      <w:tr>
+        <w:tc>
+          <w:tcPr>
+            <w:tcW w:type="dxa" w:w="9317"/>
+            <w:shd w:val="clear" w:color="auto" w:fill="F4F8FD"/>
+            <w:tcMar>
+              <w:top w:w="140" w:type="dxa"/>
+              <w:bottom w:w="140" w:type="dxa"/>
+              <w:left w:w="200" w:type="dxa"/>
+              <w:right w:w="200" w:type="dxa"/>
+            </w:tcMar>
+            <w:tcBorders>
+              <w:left w:val="single" w:sz="24" w:space="0" w:color="0D6EFD"/>
+              <w:top w:val="single" w:sz="4" w:space="0" w:color="DEE2E6"/>
+              <w:bottom w:val="single" w:sz="4" w:space="0" w:color="DEE2E6"/>
+              <w:right w:val="single" w:sz="4" w:space="0" w:color="DEE2E6"/>
+            </w:tcBorders>
+          </w:tcPr>
+          <w:p>
+            <w:pPr>
+              <w:spacing w:after="80"/>
+              <w:jc w:val="left"/>
+            </w:pPr>
+            <w:r>
+              <w:rPr>
+                <w:b/>
+                <w:color w:val="0D6EFD"/>
+                <w:sz w:val="22"/>
+              </w:rPr>
+              <w:t>✦ Công thức 6: Căn bậc hai Sai số Bình phương Trung bình (RMSE)</w:t>
+            </w:r>
+          </w:p>
+          <w:p>
+            <w:pPr>
+              <w:spacing w:before="160" w:after="160"/>
+              <w:jc w:val="center"/>
+            </w:pPr>
+            <m:oMathPara>
+              <m:oMath>
+                <m:r>
+                  <m:t>RMSE = </m:t>
+                </m:r>
+                <m:rad>
+                  <m:radPr>
+                    <m:degHide m:val="1"/>
+                  </m:radPr>
+                  <m:e>
+                    <m:f>
+                      <m:num>
+                        <m:r>
+                          <m:t>1</m:t>
+                        </m:r>
+                      </m:num>
+                      <m:den>
+                        <m:r>
+                          <m:t>n</m:t>
+                        </m:r>
+                      </m:den>
+                    </m:f>
+                    <m:nary>
+                      <m:naryPr>
+                        <m:chr m:val="∑"/>
+                        <m:limLoc m:val="undOvr"/>
+                      </m:naryPr>
+                      <m:sub>
+                        <m:r>
+                          <m:t>i=1</m:t>
+                        </m:r>
+                      </m:sub>
+                      <m:sup>
+                        <m:r>
+                          <m:t>n</m:t>
+                        </m:r>
+                      </m:sup>
+                      <m:e>
+                        <m:sSup>
+                          <m:e>
+                            <m:d>
+                              <m:dPr>
+                                <m:begChr m:val="("/>
+                                <m:endChr m:val=")"/>
+                              </m:dPr>
+                              <m:e>
+                                <m:sSub>
+                                  <m:e>
+                                    <m:r>
+                                      <m:t>y</m:t>
+                                    </m:r>
+                                  </m:e>
+                                  <m:sub>
+                                    <m:r>
+                                      <m:t>i</m:t>
+                                    </m:r>
+                                  </m:sub>
+                                </m:sSub>
+                                <m:r>
+                                  <m:t>-</m:t>
+                                </m:r>
+                                <m:sSubSup>
+                                  <m:e>
+                                    <m:r>
+                                      <m:t>y</m:t>
+                                    </m:r>
+                                  </m:e>
+                                  <m:sub>
+                                    <m:r>
+                                      <m:t>i</m:t>
+                                    </m:r>
+                                  </m:sub>
+                                  <m:sup>
+                                    <m:r>
+                                      <m:t>^</m:t>
+                                    </m:r>
+                                  </m:sup>
+                                </m:sSubSup>
+                              </m:e>
+                            </m:d>
+                          </m:e>
+                          <m:sup>
+                            <m:r>
+                              <m:t>2</m:t>
+                            </m:r>
+                          </m:sup>
+                        </m:sSup>
+                      </m:e>
+                    </m:nary>
+                  </m:e>
+                </m:rad>
+              </m:oMath>
+            </m:oMathPara>
+          </w:p>
+          <w:p>
+            <w:pPr>
+              <w:spacing w:before="80" w:after="0" w:line="288" w:lineRule="auto"/>
+            </w:pPr>
+            <w:r>
+              <w:rPr>
+                <w:b/>
+                <w:i/>
+                <w:sz w:val="19"/>
+              </w:rPr>
+              <w:t>Trong đó:</w:t>
+              <w:br/>
+            </w:r>
+            <w:r>
+              <w:rPr>
+                <w:b/>
+                <w:sz w:val="19"/>
+              </w:rPr>
+              <w:t xml:space="preserve">  • RMSE: </w:t>
+            </w:r>
+            <w:r>
+              <w:rPr>
+                <w:sz w:val="19"/>
+              </w:rPr>
+              <w:t>Căn bậc hai của sai số bình phương trung bình (đơn vị: VNĐ)</w:t>
+              <w:br/>
+            </w:r>
+            <w:r>
+              <w:rPr>
+                <w:b/>
+                <w:sz w:val="19"/>
+              </w:rPr>
+              <w:t xml:space="preserve">  • Đặc tính: </w:t>
+            </w:r>
+            <w:r>
+              <w:rPr>
+                <w:sz w:val="19"/>
+              </w:rPr>
+              <w:t>Phạt nặng hơn đối với các dự đoán có sai số lớn nhờ bước bình phương sai số trước khi lấy căn</w:t>
+              <w:br/>
+            </w:r>
+          </w:p>
+        </w:tc>
+      </w:tr>
+    </w:tbl>
+    <w:p>
+      <w:pPr>
+        <w:spacing w:after="120"/>
+      </w:pPr>
+    </w:p>
+    <w:tbl>
+      <w:tblPr>
+        <w:tblW w:type="auto" w:w="0"/>
+        <w:jc w:val="center"/>
+        <w:tblLook w:firstColumn="1" w:firstRow="1" w:lastColumn="0" w:lastRow="0" w:noHBand="0" w:noVBand="1" w:val="04A0"/>
+      </w:tblPr>
+      <w:tblGrid>
+        <w:gridCol w:w="9317"/>
+      </w:tblGrid>
+      <w:tr>
+        <w:tc>
+          <w:tcPr>
+            <w:tcW w:type="dxa" w:w="9317"/>
+            <w:shd w:val="clear" w:color="auto" w:fill="F4F8FD"/>
+            <w:tcMar>
+              <w:top w:w="140" w:type="dxa"/>
+              <w:bottom w:w="140" w:type="dxa"/>
+              <w:left w:w="200" w:type="dxa"/>
+              <w:right w:w="200" w:type="dxa"/>
+            </w:tcMar>
+            <w:tcBorders>
+              <w:left w:val="single" w:sz="24" w:space="0" w:color="0D6EFD"/>
+              <w:top w:val="single" w:sz="4" w:space="0" w:color="DEE2E6"/>
+              <w:bottom w:val="single" w:sz="4" w:space="0" w:color="DEE2E6"/>
+              <w:right w:val="single" w:sz="4" w:space="0" w:color="DEE2E6"/>
+            </w:tcBorders>
+          </w:tcPr>
+          <w:p>
+            <w:pPr>
+              <w:spacing w:after="80"/>
+              <w:jc w:val="left"/>
+            </w:pPr>
+            <w:r>
+              <w:rPr>
+                <w:b/>
+                <w:color w:val="0D6EFD"/>
+                <w:sz w:val="22"/>
+              </w:rPr>
+              <w:t>✦ Công thức 7: Hệ số Xác định (Coefficient of Determination - R² Score)</w:t>
+            </w:r>
+          </w:p>
+          <w:p>
+            <w:pPr>
+              <w:spacing w:before="160" w:after="160"/>
+              <w:jc w:val="center"/>
+            </w:pPr>
+            <m:oMathPara>
+              <m:oMath>
+                <m:sSup>
+                  <m:e>
+                    <m:r>
+                      <m:t>R</m:t>
+                    </m:r>
+                  </m:e>
+                  <m:sup>
+                    <m:r>
+                      <m:t>2</m:t>
+                    </m:r>
+                  </m:sup>
+                </m:sSup>
+                <m:r>
+                  <m:t> = 1 - </m:t>
+                </m:r>
+                <m:f>
+                  <m:num>
+                    <m:sSub>
+                      <m:e>
+                        <m:r>
+                          <m:t>SS</m:t>
+                        </m:r>
+                      </m:e>
+                      <m:sub>
+                        <m:r>
+                          <m:t>res</m:t>
+                        </m:r>
+                      </m:sub>
+                    </m:sSub>
+                  </m:num>
+                  <m:den>
+                    <m:sSub>
+                      <m:e>
+                        <m:r>
+                          <m:t>SS</m:t>
+                        </m:r>
+                      </m:e>
+                      <m:sub>
+                        <m:r>
+                          <m:t>tot</m:t>
+                        </m:r>
+                      </m:sub>
+                    </m:sSub>
+                  </m:den>
+                </m:f>
+                <m:r>
+                  <m:t> = 1 - </m:t>
+                </m:r>
+                <m:f>
+                  <m:num>
+                    <m:nary>
+                      <m:naryPr>
+                        <m:chr m:val="∑"/>
+                        <m:limLoc m:val="undOvr"/>
+                      </m:naryPr>
+                      <m:sub>
+                        <m:r>
+                          <m:t>i=1</m:t>
+                        </m:r>
+                      </m:sub>
+                      <m:sup>
+                        <m:r>
+                          <m:t>n</m:t>
+                        </m:r>
+                      </m:sup>
+                      <m:e>
+                        <m:sSup>
+                          <m:e>
+                            <m:d>
+                              <m:dPr>
+                                <m:begChr m:val="("/>
+                                <m:endChr m:val=")"/>
+                              </m:dPr>
+                              <m:e>
+                                <m:sSub>
+                                  <m:e>
+                                    <m:r>
+                                      <m:t>y</m:t>
+                                    </m:r>
+                                  </m:e>
+                                  <m:sub>
+                                    <m:r>
+                                      <m:t>i</m:t>
+                                    </m:r>
+                                  </m:sub>
+                                </m:sSub>
+                                <m:r>
+                                  <m:t>-</m:t>
+                                </m:r>
+                                <m:sSubSup>
+                                  <m:e>
+                                    <m:r>
+                                      <m:t>y</m:t>
+                                    </m:r>
+                                  </m:e>
+                                  <m:sub>
+                                    <m:r>
+                                      <m:t>i</m:t>
+                                    </m:r>
+                                  </m:sub>
+                                  <m:sup>
+                                    <m:r>
+                                      <m:t>^</m:t>
+                                    </m:r>
+                                  </m:sup>
+                                </m:sSubSup>
+                              </m:e>
+                            </m:d>
+                          </m:e>
+                          <m:sup>
+                            <m:r>
+                              <m:t>2</m:t>
+                            </m:r>
+                          </m:sup>
+                        </m:sSup>
+                      </m:e>
+                    </m:nary>
+                  </m:num>
+                  <m:den>
+                    <m:nary>
+                      <m:naryPr>
+                        <m:chr m:val="∑"/>
+                        <m:limLoc m:val="undOvr"/>
+                      </m:naryPr>
+                      <m:sub>
+                        <m:r>
+                          <m:t>i=1</m:t>
+                        </m:r>
+                      </m:sub>
+                      <m:sup>
+                        <m:r>
+                          <m:t>n</m:t>
+                        </m:r>
+                      </m:sup>
+                      <m:e>
+                        <m:sSup>
+                          <m:e>
+                            <m:d>
+                              <m:dPr>
+                                <m:begChr m:val="("/>
+                                <m:endChr m:val=")"/>
+                              </m:dPr>
+                              <m:e>
+                                <m:sSub>
+                                  <m:e>
+                                    <m:r>
+                                      <m:t>y</m:t>
+                                    </m:r>
+                                  </m:e>
+                                  <m:sub>
+                                    <m:r>
+                                      <m:t>i</m:t>
+                                    </m:r>
+                                  </m:sub>
+                                </m:sSub>
+                                <m:r>
+                                  <m:t>-</m:t>
+                                </m:r>
+                                <m:r>
+                                  <m:t>ȳ</m:t>
+                                </m:r>
+                              </m:e>
+                            </m:d>
+                          </m:e>
+                          <m:sup>
+                            <m:r>
+                              <m:t>2</m:t>
+                            </m:r>
+                          </m:sup>
+                        </m:sSup>
+                      </m:e>
+                    </m:nary>
+                  </m:den>
+                </m:f>
+              </m:oMath>
+            </m:oMathPara>
+          </w:p>
+          <w:p>
+            <w:pPr>
+              <w:spacing w:before="80" w:after="0" w:line="288" w:lineRule="auto"/>
+            </w:pPr>
+            <w:r>
+              <w:rPr>
+                <w:b/>
+                <w:i/>
+                <w:sz w:val="19"/>
+              </w:rPr>
+              <w:t>Trong đó:</w:t>
+              <w:br/>
+            </w:r>
+            <w:r>
+              <w:rPr>
+                <w:b/>
+                <w:sz w:val="19"/>
+              </w:rPr>
+              <w:t xml:space="preserve">  • R²: </w:t>
+            </w:r>
+            <w:r>
+              <w:rPr>
+                <w:sz w:val="19"/>
+              </w:rPr>
+              <w:t>Tỷ lệ phương sai của giá bán laptop được mô hình giải thích (càng gần 1.0 thì mô hình càng chính xác)</w:t>
+              <w:br/>
+            </w:r>
+            <w:r>
+              <w:rPr>
+                <w:b/>
+                <w:sz w:val="19"/>
+              </w:rPr>
+              <w:t xml:space="preserve">  • SS_res: </w:t>
+            </w:r>
+            <w:r>
+              <w:rPr>
+                <w:sz w:val="19"/>
+              </w:rPr>
+              <w:t>Tổng bình phương phần dư sai số (Residual Sum of Squares)</w:t>
+              <w:br/>
+            </w:r>
+            <w:r>
+              <w:rPr>
+                <w:b/>
+                <w:sz w:val="19"/>
+              </w:rPr>
+              <w:t xml:space="preserve">  • SS_tot: </w:t>
+            </w:r>
+            <w:r>
+              <w:rPr>
+                <w:sz w:val="19"/>
+              </w:rPr>
+              <w:t>Tổng bình phương sai số toàn phần so với giá trị trung bình (Total Sum of Squares)</w:t>
+              <w:br/>
+            </w:r>
+            <w:r>
+              <w:rPr>
+                <w:b/>
+                <w:sz w:val="19"/>
+              </w:rPr>
+              <w:t xml:space="preserve">  • ȳ (y-bar): </w:t>
+            </w:r>
+            <w:r>
+              <w:rPr>
+                <w:sz w:val="19"/>
+              </w:rPr>
+              <w:t>Mức giá bán trung bình thực tế của toàn bộ 45 laptop trong tập kiểm thử</w:t>
+              <w:br/>
+            </w:r>
+          </w:p>
+        </w:tc>
+      </w:tr>
+    </w:tbl>
+    <w:p>
+      <w:pPr>
+        <w:spacing w:after="120"/>
+      </w:pPr>
+    </w:p>
+    <w:p>
+      <w:r>
+        <w:rPr>
+          <w:b/>
+        </w:rPr>
+        <w:t>3.2. Bảng So sánh Hiệu năng Thực nghiệm trên Tập Test (45 mẫu):</w:t>
         <w:br/>
-        <w:t>• RMSE (Root Mean Squared Error): Căn bậc hai của sai số bình phương trung bình, giúp đo lường mức độ ảnh hưởng của các lỗi dự đoán lớn.</w:t>
-        <w:br/>
-        <w:t>• R² Score (Coefficient of Determination): Đo lường tỷ lệ phương sai của giá bán laptop được giải thích bởi cấu hình phần cứng.</w:t>
       </w:r>
     </w:p>
     <w:tbl>
@@ -1083,10 +2969,10 @@
             <w:tcW w:type="dxa" w:w="1863"/>
             <w:shd w:val="clear" w:color="auto" w:fill="0D6EFD"/>
             <w:tcMar>
-              <w:top w:w="120" w:type="dxa"/>
-              <w:bottom w:w="120" w:type="dxa"/>
-              <w:left w:w="150" w:type="dxa"/>
-              <w:right w:w="150" w:type="dxa"/>
+              <w:top w:w="140" w:type="dxa"/>
+              <w:bottom w:w="140" w:type="dxa"/>
+              <w:left w:w="180" w:type="dxa"/>
+              <w:right w:w="180" w:type="dxa"/>
             </w:tcMar>
           </w:tcPr>
           <w:p>
@@ -1107,10 +2993,10 @@
             <w:tcW w:type="dxa" w:w="1863"/>
             <w:shd w:val="clear" w:color="auto" w:fill="0D6EFD"/>
             <w:tcMar>
-              <w:top w:w="120" w:type="dxa"/>
-              <w:bottom w:w="120" w:type="dxa"/>
-              <w:left w:w="150" w:type="dxa"/>
-              <w:right w:w="150" w:type="dxa"/>
+              <w:top w:w="140" w:type="dxa"/>
+              <w:bottom w:w="140" w:type="dxa"/>
+              <w:left w:w="180" w:type="dxa"/>
+              <w:right w:w="180" w:type="dxa"/>
             </w:tcMar>
           </w:tcPr>
           <w:p>
@@ -1131,10 +3017,10 @@
             <w:tcW w:type="dxa" w:w="1863"/>
             <w:shd w:val="clear" w:color="auto" w:fill="0D6EFD"/>
             <w:tcMar>
-              <w:top w:w="120" w:type="dxa"/>
-              <w:bottom w:w="120" w:type="dxa"/>
-              <w:left w:w="150" w:type="dxa"/>
-              <w:right w:w="150" w:type="dxa"/>
+              <w:top w:w="140" w:type="dxa"/>
+              <w:bottom w:w="140" w:type="dxa"/>
+              <w:left w:w="180" w:type="dxa"/>
+              <w:right w:w="180" w:type="dxa"/>
             </w:tcMar>
           </w:tcPr>
           <w:p>
@@ -1155,10 +3041,10 @@
             <w:tcW w:type="dxa" w:w="1863"/>
             <w:shd w:val="clear" w:color="auto" w:fill="0D6EFD"/>
             <w:tcMar>
-              <w:top w:w="120" w:type="dxa"/>
-              <w:bottom w:w="120" w:type="dxa"/>
-              <w:left w:w="150" w:type="dxa"/>
-              <w:right w:w="150" w:type="dxa"/>
+              <w:top w:w="140" w:type="dxa"/>
+              <w:bottom w:w="140" w:type="dxa"/>
+              <w:left w:w="180" w:type="dxa"/>
+              <w:right w:w="180" w:type="dxa"/>
             </w:tcMar>
           </w:tcPr>
           <w:p>
@@ -1179,10 +3065,10 @@
             <w:tcW w:type="dxa" w:w="1863"/>
             <w:shd w:val="clear" w:color="auto" w:fill="0D6EFD"/>
             <w:tcMar>
-              <w:top w:w="120" w:type="dxa"/>
-              <w:bottom w:w="120" w:type="dxa"/>
-              <w:left w:w="150" w:type="dxa"/>
-              <w:right w:w="150" w:type="dxa"/>
+              <w:top w:w="140" w:type="dxa"/>
+              <w:bottom w:w="140" w:type="dxa"/>
+              <w:left w:w="180" w:type="dxa"/>
+              <w:right w:w="180" w:type="dxa"/>
             </w:tcMar>
           </w:tcPr>
           <w:p>
@@ -1205,10 +3091,10 @@
             <w:tcW w:type="dxa" w:w="1863"/>
             <w:shd w:val="clear" w:color="auto" w:fill="FFFFFF"/>
             <w:tcMar>
-              <w:top w:w="120" w:type="dxa"/>
-              <w:bottom w:w="120" w:type="dxa"/>
-              <w:left w:w="150" w:type="dxa"/>
-              <w:right w:w="150" w:type="dxa"/>
+              <w:top w:w="140" w:type="dxa"/>
+              <w:bottom w:w="140" w:type="dxa"/>
+              <w:left w:w="180" w:type="dxa"/>
+              <w:right w:w="180" w:type="dxa"/>
             </w:tcMar>
           </w:tcPr>
           <w:p>
@@ -1222,10 +3108,10 @@
             <w:tcW w:type="dxa" w:w="1863"/>
             <w:shd w:val="clear" w:color="auto" w:fill="FFFFFF"/>
             <w:tcMar>
-              <w:top w:w="120" w:type="dxa"/>
-              <w:bottom w:w="120" w:type="dxa"/>
-              <w:left w:w="150" w:type="dxa"/>
-              <w:right w:w="150" w:type="dxa"/>
+              <w:top w:w="140" w:type="dxa"/>
+              <w:bottom w:w="140" w:type="dxa"/>
+              <w:left w:w="180" w:type="dxa"/>
+              <w:right w:w="180" w:type="dxa"/>
             </w:tcMar>
           </w:tcPr>
           <w:p>
@@ -1239,10 +3125,10 @@
             <w:tcW w:type="dxa" w:w="1863"/>
             <w:shd w:val="clear" w:color="auto" w:fill="FFFFFF"/>
             <w:tcMar>
-              <w:top w:w="120" w:type="dxa"/>
-              <w:bottom w:w="120" w:type="dxa"/>
-              <w:left w:w="150" w:type="dxa"/>
-              <w:right w:w="150" w:type="dxa"/>
+              <w:top w:w="140" w:type="dxa"/>
+              <w:bottom w:w="140" w:type="dxa"/>
+              <w:left w:w="180" w:type="dxa"/>
+              <w:right w:w="180" w:type="dxa"/>
             </w:tcMar>
           </w:tcPr>
           <w:p>
@@ -1259,10 +3145,10 @@
             <w:tcW w:type="dxa" w:w="1863"/>
             <w:shd w:val="clear" w:color="auto" w:fill="FFFFFF"/>
             <w:tcMar>
-              <w:top w:w="120" w:type="dxa"/>
-              <w:bottom w:w="120" w:type="dxa"/>
-              <w:left w:w="150" w:type="dxa"/>
-              <w:right w:w="150" w:type="dxa"/>
+              <w:top w:w="140" w:type="dxa"/>
+              <w:bottom w:w="140" w:type="dxa"/>
+              <w:left w:w="180" w:type="dxa"/>
+              <w:right w:w="180" w:type="dxa"/>
             </w:tcMar>
           </w:tcPr>
           <w:p>
@@ -1279,10 +3165,10 @@
             <w:tcW w:type="dxa" w:w="1863"/>
             <w:shd w:val="clear" w:color="auto" w:fill="FFFFFF"/>
             <w:tcMar>
-              <w:top w:w="120" w:type="dxa"/>
-              <w:bottom w:w="120" w:type="dxa"/>
-              <w:left w:w="150" w:type="dxa"/>
-              <w:right w:w="150" w:type="dxa"/>
+              <w:top w:w="140" w:type="dxa"/>
+              <w:bottom w:w="140" w:type="dxa"/>
+              <w:left w:w="180" w:type="dxa"/>
+              <w:right w:w="180" w:type="dxa"/>
             </w:tcMar>
           </w:tcPr>
           <w:p>
@@ -1301,10 +3187,10 @@
             <w:tcW w:type="dxa" w:w="1863"/>
             <w:shd w:val="clear" w:color="auto" w:fill="E7F1FF"/>
             <w:tcMar>
-              <w:top w:w="120" w:type="dxa"/>
-              <w:bottom w:w="120" w:type="dxa"/>
-              <w:left w:w="150" w:type="dxa"/>
-              <w:right w:w="150" w:type="dxa"/>
+              <w:top w:w="140" w:type="dxa"/>
+              <w:bottom w:w="140" w:type="dxa"/>
+              <w:left w:w="180" w:type="dxa"/>
+              <w:right w:w="180" w:type="dxa"/>
             </w:tcMar>
           </w:tcPr>
           <w:p>
@@ -1318,15 +3204,15 @@
             <w:tcW w:type="dxa" w:w="1863"/>
             <w:shd w:val="clear" w:color="auto" w:fill="E7F1FF"/>
             <w:tcMar>
-              <w:top w:w="120" w:type="dxa"/>
-              <w:bottom w:w="120" w:type="dxa"/>
-              <w:left w:w="150" w:type="dxa"/>
-              <w:right w:w="150" w:type="dxa"/>
+              <w:top w:w="140" w:type="dxa"/>
+              <w:bottom w:w="140" w:type="dxa"/>
+              <w:left w:w="180" w:type="dxa"/>
+              <w:right w:w="180" w:type="dxa"/>
             </w:tcMar>
           </w:tcPr>
           <w:p>
             <w:r>
-              <w:t>Không cần scale (Tree-based)</w:t>
+              <w:t>Ensemble Learning (Không cần scale)</w:t>
             </w:r>
           </w:p>
         </w:tc>
@@ -1335,10 +3221,10 @@
             <w:tcW w:type="dxa" w:w="1863"/>
             <w:shd w:val="clear" w:color="auto" w:fill="E7F1FF"/>
             <w:tcMar>
-              <w:top w:w="120" w:type="dxa"/>
-              <w:bottom w:w="120" w:type="dxa"/>
-              <w:left w:w="150" w:type="dxa"/>
-              <w:right w:w="150" w:type="dxa"/>
+              <w:top w:w="140" w:type="dxa"/>
+              <w:bottom w:w="140" w:type="dxa"/>
+              <w:left w:w="180" w:type="dxa"/>
+              <w:right w:w="180" w:type="dxa"/>
             </w:tcMar>
           </w:tcPr>
           <w:p>
@@ -1359,10 +3245,10 @@
             <w:tcW w:type="dxa" w:w="1863"/>
             <w:shd w:val="clear" w:color="auto" w:fill="E7F1FF"/>
             <w:tcMar>
-              <w:top w:w="120" w:type="dxa"/>
-              <w:bottom w:w="120" w:type="dxa"/>
-              <w:left w:w="150" w:type="dxa"/>
-              <w:right w:w="150" w:type="dxa"/>
+              <w:top w:w="140" w:type="dxa"/>
+              <w:bottom w:w="140" w:type="dxa"/>
+              <w:left w:w="180" w:type="dxa"/>
+              <w:right w:w="180" w:type="dxa"/>
             </w:tcMar>
           </w:tcPr>
           <w:p>
@@ -1383,10 +3269,10 @@
             <w:tcW w:type="dxa" w:w="1863"/>
             <w:shd w:val="clear" w:color="auto" w:fill="E7F1FF"/>
             <w:tcMar>
-              <w:top w:w="120" w:type="dxa"/>
-              <w:bottom w:w="120" w:type="dxa"/>
-              <w:left w:w="150" w:type="dxa"/>
-              <w:right w:w="150" w:type="dxa"/>
+              <w:top w:w="140" w:type="dxa"/>
+              <w:bottom w:w="140" w:type="dxa"/>
+              <w:left w:w="180" w:type="dxa"/>
+              <w:right w:w="180" w:type="dxa"/>
             </w:tcMar>
           </w:tcPr>
           <w:p>
@@ -1414,17 +3300,13 @@
         <w:rPr>
           <w:b/>
         </w:rPr>
-        <w:t>3.2. Phân tích kết quả &amp; Lựa chọn mô hình thành phẩm:</w:t>
+        <w:t>3.3. Đánh giá Kết quả &amp; Đóng gói Mô hình Thành phẩm:</w:t>
         <w:br/>
       </w:r>
       <w:r>
-        <w:t>Kết quả đánh giá trên 45 mẫu Test độc lập cho thấy:</w:t>
+        <w:t>• Random Forest Regressor áp đảo toàn diện: Sai số trung bình MAE giảm mạnh từ 6.06 triệu xuống 4.10 triệu VNĐ (độ chính xác tăng thêm 32.2%), hệ số giải thích biến thiên R² đạt tới 88.21%.</w:t>
         <w:br/>
-        <w:t>• Random Forest Regressor vượt trội toàn diện so với Linear Regression: Sai số trung bình MAE giảm mạnh từ 6.06 triệu xuống còn 4.10 triệu VNĐ (cải thiện hơn 32.2%), đồng thời hệ số giải thích phương sai R² tăng từ 80.98% lên 88.21%.</w:t>
-        <w:br/>
-        <w:t>• Hệ thống thiết kế cơ chế tự động hóa: Tự động so sánh R² của cả hai thuật toán và lưu trữ mô hình có R² cao nhất vào file nhị phân models/laptop_price_model.pkl.</w:t>
-        <w:br/>
-        <w:t>• Cấu trúc Model Payload được đóng gói bằng Joblib gồm: model pipeline, model_name, danh sách features, chỉ số đánh giá của cả hai mô hình (MAE, RMSE, R²), kích thước tập train và test.</w:t>
+        <w:t>• Hệ thống tự động chọn mô hình có R² lớn nhất và đóng gói vào models/laptop_price_model.pkl bằng Joblib. File model nhị phân kích thước ~1.4 MB chứa trọn vẹn trọng số cây và siêu dữ liệu đánh giá, sẵn sàng phục vụ tức thì mà không cần train lại.</w:t>
       </w:r>
     </w:p>
     <w:p>
@@ -1440,11 +3322,11 @@
         <w:rPr>
           <w:b/>
         </w:rPr>
-        <w:t>4.1. Bài toán Đề xuất Sản phẩm theo Tầm giá &amp; Cấu hình:</w:t>
+        <w:t>4.1. Bài toán Gợi ý Sản phẩm Tối ưu theo Tầm giá:</w:t>
         <w:br/>
       </w:r>
       <w:r>
-        <w:t>Một hệ thống định giá thông minh không thể chỉ trả về một con số giá đơn độc. Để tối ưu giá trị cho người dùng, hệ thống tích hợp hàm recommend_similar_laptops() tự động quét toàn bộ 225 laptop thực tế để tìm ra 5 mẫu máy có giá xấp xỉ mức giá ước tính (chênh lệch trong khoảng ±1 đến 2 triệu đồng) và có sự tương đồng cao nhất về phần cứng.</w:t>
+        <w:t>Sau khi ước tính được giá, hệ thống thực hiện thuật toán tìm kiếm 5 laptop thực tế có cấu hình tương đương và mức giá chênh lệch trong khoảng ±1 đến 2 triệu đồng so với giá ước tính.</w:t>
       </w:r>
     </w:p>
     <w:p>
@@ -1452,11 +3334,11 @@
         <w:rPr>
           <w:b/>
         </w:rPr>
-        <w:t>4.2. Trọng số hóa linh kiện phần cứng (Weighted Normalized Distance):</w:t>
+        <w:t>4.2. Khoảng cách Cấu hình Chuẩn hóa có Trọng số (Weighted Normalized Distance):</w:t>
         <w:br/>
       </w:r>
       <w:r>
-        <w:t>Không phải linh kiện nào cũng đóng vai trò quyết định tương đương nhau khi so sánh laptop. CPU và GPU là hai bộ não chính định hình hiệu năng, do đó được gán trọng số cao nhất. Bảng trọng số thành phần cấu hình:</w:t>
+        <w:t>Để so sánh hai cấu hình máy tính gồm nhiều thuộc tính có đơn vị đo khác nhau (Điểm PassMark, GB RAM, Inch màn hình...), mỗi đặc trưng được chuẩn hóa theo độ lệch chuẩn toàn thể (Z-score Scaling) và nhân với trọng số linh kiện tương ứng:</w:t>
       </w:r>
     </w:p>
     <w:tbl>
@@ -1466,528 +3348,308 @@
         <w:tblLook w:firstColumn="1" w:firstRow="1" w:lastColumn="0" w:lastRow="0" w:noHBand="0" w:noVBand="1" w:val="04A0"/>
       </w:tblPr>
       <w:tblGrid>
-        <w:gridCol w:w="3106"/>
-        <w:gridCol w:w="3106"/>
-        <w:gridCol w:w="3106"/>
+        <w:gridCol w:w="9317"/>
       </w:tblGrid>
       <w:tr>
         <w:tc>
           <w:tcPr>
-            <w:tcW w:type="dxa" w:w="3106"/>
-            <w:shd w:val="clear" w:color="auto" w:fill="0D6EFD"/>
+            <w:tcW w:type="dxa" w:w="9317"/>
+            <w:shd w:val="clear" w:color="auto" w:fill="F4F8FD"/>
             <w:tcMar>
-              <w:top w:w="120" w:type="dxa"/>
-              <w:bottom w:w="120" w:type="dxa"/>
-              <w:left w:w="150" w:type="dxa"/>
-              <w:right w:w="150" w:type="dxa"/>
+              <w:top w:w="140" w:type="dxa"/>
+              <w:bottom w:w="140" w:type="dxa"/>
+              <w:left w:w="200" w:type="dxa"/>
+              <w:right w:w="200" w:type="dxa"/>
             </w:tcMar>
+            <w:tcBorders>
+              <w:left w:val="single" w:sz="24" w:space="0" w:color="0D6EFD"/>
+              <w:top w:val="single" w:sz="4" w:space="0" w:color="DEE2E6"/>
+              <w:bottom w:val="single" w:sz="4" w:space="0" w:color="DEE2E6"/>
+              <w:right w:val="single" w:sz="4" w:space="0" w:color="DEE2E6"/>
+            </w:tcBorders>
           </w:tcPr>
           <w:p>
             <w:pPr>
-              <w:jc w:val="center"/>
+              <w:spacing w:after="80"/>
+              <w:jc w:val="left"/>
             </w:pPr>
             <w:r>
               <w:rPr>
                 <w:b/>
-                <w:color w:val="FFFFFF"/>
+                <w:color w:val="0D6EFD"/>
+                <w:sz w:val="22"/>
               </w:rPr>
-              <w:t>Linh kiện / Đặc trưng</w:t>
+              <w:t>✦ Công thức 8: Khoảng cách Cấu hình Chuẩn hóa có Trọng số (Weighted Normalized Distance)</w:t>
             </w:r>
           </w:p>
-        </w:tc>
-        <w:tc>
-          <w:tcPr>
-            <w:tcW w:type="dxa" w:w="3106"/>
-            <w:shd w:val="clear" w:color="auto" w:fill="0D6EFD"/>
-            <w:tcMar>
-              <w:top w:w="120" w:type="dxa"/>
-              <w:bottom w:w="120" w:type="dxa"/>
-              <w:left w:w="150" w:type="dxa"/>
-              <w:right w:w="150" w:type="dxa"/>
-            </w:tcMar>
-          </w:tcPr>
           <w:p>
             <w:pPr>
+              <w:spacing w:before="160" w:after="160"/>
               <w:jc w:val="center"/>
+            </w:pPr>
+            <m:oMathPara>
+              <m:oMath>
+                <m:sSub>
+                  <m:e>
+                    <m:r>
+                      <m:t>d</m:t>
+                    </m:r>
+                  </m:e>
+                  <m:sub>
+                    <m:r>
+                      <m:t>config</m:t>
+                    </m:r>
+                  </m:sub>
+                </m:sSub>
+                <m:d>
+                  <m:dPr>
+                    <m:begChr m:val="("/>
+                    <m:endChr m:val=")"/>
+                  </m:dPr>
+                  <m:e>
+                    <m:r>
+                      <m:t>x, </m:t>
+                    </m:r>
+                    <m:sSub>
+                      <m:e>
+                        <m:r>
+                          <m:t>x</m:t>
+                        </m:r>
+                      </m:e>
+                      <m:sub>
+                        <m:r>
+                          <m:t>user</m:t>
+                        </m:r>
+                      </m:sub>
+                    </m:sSub>
+                  </m:e>
+                </m:d>
+                <m:r>
+                  <m:t> = </m:t>
+                </m:r>
+                <m:rad>
+                  <m:radPr>
+                    <m:degHide m:val="1"/>
+                  </m:radPr>
+                  <m:e>
+                    <m:f>
+                      <m:num>
+                        <m:nary>
+                          <m:naryPr>
+                            <m:chr m:val="∑"/>
+                            <m:limLoc m:val="undOvr"/>
+                          </m:naryPr>
+                          <m:sub>
+                            <m:r>
+                              <m:t>k=1</m:t>
+                            </m:r>
+                          </m:sub>
+                          <m:sup>
+                            <m:r>
+                              <m:t>K</m:t>
+                            </m:r>
+                          </m:sup>
+                          <m:e>
+                            <m:sSub>
+                              <m:e>
+                                <m:r>
+                                  <m:t>w</m:t>
+                                </m:r>
+                              </m:e>
+                              <m:sub>
+                                <m:r>
+                                  <m:t>k</m:t>
+                                </m:r>
+                              </m:sub>
+                            </m:sSub>
+                            <m:r>
+                              <m:t>·</m:t>
+                            </m:r>
+                            <m:sSup>
+                              <m:e>
+                                <m:d>
+                                  <m:dPr>
+                                    <m:begChr m:val="("/>
+                                    <m:endChr m:val=")"/>
+                                  </m:dPr>
+                                  <m:e>
+                                    <m:f>
+                                      <m:num>
+                                        <m:sSub>
+                                          <m:e>
+                                            <m:r>
+                                              <m:t>x</m:t>
+                                            </m:r>
+                                          </m:e>
+                                          <m:sub>
+                                            <m:r>
+                                              <m:t>k</m:t>
+                                            </m:r>
+                                          </m:sub>
+                                        </m:sSub>
+                                        <m:r>
+                                          <m:t>-</m:t>
+                                        </m:r>
+                                        <m:sSub>
+                                          <m:e>
+                                            <m:r>
+                                              <m:t>x</m:t>
+                                            </m:r>
+                                          </m:e>
+                                          <m:sub>
+                                            <m:r>
+                                              <m:t>user,k</m:t>
+                                            </m:r>
+                                          </m:sub>
+                                        </m:sSub>
+                                      </m:num>
+                                      <m:den>
+                                        <m:sSub>
+                                          <m:e>
+                                            <m:r>
+                                              <m:t>σ</m:t>
+                                            </m:r>
+                                          </m:e>
+                                          <m:sub>
+                                            <m:r>
+                                              <m:t>k</m:t>
+                                            </m:r>
+                                          </m:sub>
+                                        </m:sSub>
+                                      </m:den>
+                                    </m:f>
+                                  </m:e>
+                                </m:d>
+                              </m:e>
+                              <m:sup>
+                                <m:r>
+                                  <m:t>2</m:t>
+                                </m:r>
+                              </m:sup>
+                            </m:sSup>
+                          </m:e>
+                        </m:nary>
+                      </m:num>
+                      <m:den>
+                        <m:nary>
+                          <m:naryPr>
+                            <m:chr m:val="∑"/>
+                            <m:limLoc m:val="undOvr"/>
+                          </m:naryPr>
+                          <m:sub>
+                            <m:r>
+                              <m:t>k=1</m:t>
+                            </m:r>
+                          </m:sub>
+                          <m:sup>
+                            <m:r>
+                              <m:t>K</m:t>
+                            </m:r>
+                          </m:sup>
+                          <m:e>
+                            <m:sSub>
+                              <m:e>
+                                <m:r>
+                                  <m:t>w</m:t>
+                                </m:r>
+                              </m:e>
+                              <m:sub>
+                                <m:r>
+                                  <m:t>k</m:t>
+                                </m:r>
+                              </m:sub>
+                            </m:sSub>
+                          </m:e>
+                        </m:nary>
+                      </m:den>
+                    </m:f>
+                  </m:e>
+                </m:rad>
+              </m:oMath>
+            </m:oMathPara>
+          </w:p>
+          <w:p>
+            <w:pPr>
+              <w:spacing w:before="80" w:after="0" w:line="288" w:lineRule="auto"/>
             </w:pPr>
             <w:r>
               <w:rPr>
                 <w:b/>
-                <w:color w:val="FFFFFF"/>
+                <w:i/>
+                <w:sz w:val="19"/>
               </w:rPr>
-              <w:t>Trọng số (Weight)</w:t>
+              <w:t>Trong đó:</w:t>
+              <w:br/>
             </w:r>
-          </w:p>
-        </w:tc>
-        <w:tc>
-          <w:tcPr>
-            <w:tcW w:type="dxa" w:w="3106"/>
-            <w:shd w:val="clear" w:color="auto" w:fill="0D6EFD"/>
-            <w:tcMar>
-              <w:top w:w="120" w:type="dxa"/>
-              <w:bottom w:w="120" w:type="dxa"/>
-              <w:left w:w="150" w:type="dxa"/>
-              <w:right w:w="150" w:type="dxa"/>
-            </w:tcMar>
-          </w:tcPr>
-          <w:p>
-            <w:pPr>
-              <w:jc w:val="center"/>
-            </w:pPr>
             <w:r>
               <w:rPr>
                 <w:b/>
-                <w:color w:val="FFFFFF"/>
+                <w:sz w:val="19"/>
               </w:rPr>
-              <w:t>Mức độ ưu tiên &amp; Giải thích</w:t>
+              <w:t xml:space="preserve">  • d_config: </w:t>
             </w:r>
-          </w:p>
-        </w:tc>
-      </w:tr>
-      <w:tr>
-        <w:tc>
-          <w:tcPr>
-            <w:tcW w:type="dxa" w:w="3106"/>
-            <w:shd w:val="clear" w:color="auto" w:fill="F8F9FA"/>
-            <w:tcMar>
-              <w:top w:w="120" w:type="dxa"/>
-              <w:bottom w:w="120" w:type="dxa"/>
-              <w:left w:w="150" w:type="dxa"/>
-              <w:right w:w="150" w:type="dxa"/>
-            </w:tcMar>
-          </w:tcPr>
-          <w:p>
             <w:r>
-              <w:t>cpu_score (Điểm CPU)</w:t>
+              <w:rPr>
+                <w:sz w:val="19"/>
+              </w:rPr>
+              <w:t>Chỉ số khoảng cách hình học đo mức độ khác biệt cấu hình giữa 2 mẫu máy (giá trị càng nhỏ càng giống nhau)</w:t>
+              <w:br/>
             </w:r>
-          </w:p>
-        </w:tc>
-        <w:tc>
-          <w:tcPr>
-            <w:tcW w:type="dxa" w:w="3106"/>
-            <w:shd w:val="clear" w:color="auto" w:fill="F8F9FA"/>
-            <w:tcMar>
-              <w:top w:w="120" w:type="dxa"/>
-              <w:bottom w:w="120" w:type="dxa"/>
-              <w:left w:w="150" w:type="dxa"/>
-              <w:right w:w="150" w:type="dxa"/>
-            </w:tcMar>
-          </w:tcPr>
-          <w:p>
-            <w:pPr>
-              <w:jc w:val="center"/>
-            </w:pPr>
             <w:r>
-              <w:t>2.5</w:t>
+              <w:rPr>
+                <w:b/>
+                <w:sz w:val="19"/>
+              </w:rPr>
+              <w:t xml:space="preserve">  • w_k: </w:t>
             </w:r>
-          </w:p>
-        </w:tc>
-        <w:tc>
-          <w:tcPr>
-            <w:tcW w:type="dxa" w:w="3106"/>
-            <w:shd w:val="clear" w:color="auto" w:fill="F8F9FA"/>
-            <w:tcMar>
-              <w:top w:w="120" w:type="dxa"/>
-              <w:bottom w:w="120" w:type="dxa"/>
-              <w:left w:w="150" w:type="dxa"/>
-              <w:right w:w="150" w:type="dxa"/>
-            </w:tcMar>
-          </w:tcPr>
-          <w:p>
             <w:r>
-              <w:t>Rất cao – Quyết định sức mạnh tính toán tổng thể.</w:t>
+              <w:rPr>
+                <w:sz w:val="19"/>
+              </w:rPr>
+              <w:t>Trọng số ưu tiên của linh kiện k (CPU: 2.5, GPU: 2.5, RAM: 2.0, Ổ cứng: 1.5, Màn hình: 1.0, Tần số quét: 1.0, Pin: 1.0, Cân nặng: 1.0)</w:t>
+              <w:br/>
             </w:r>
-          </w:p>
-        </w:tc>
-      </w:tr>
-      <w:tr>
-        <w:tc>
-          <w:tcPr>
-            <w:tcW w:type="dxa" w:w="3106"/>
-            <w:shd w:val="clear" w:color="auto" w:fill="FFFFFF"/>
-            <w:tcMar>
-              <w:top w:w="120" w:type="dxa"/>
-              <w:bottom w:w="120" w:type="dxa"/>
-              <w:left w:w="150" w:type="dxa"/>
-              <w:right w:w="150" w:type="dxa"/>
-            </w:tcMar>
-          </w:tcPr>
-          <w:p>
             <w:r>
-              <w:t>gpu_score (Điểm GPU)</w:t>
+              <w:rPr>
+                <w:b/>
+                <w:sz w:val="19"/>
+              </w:rPr>
+              <w:t xml:space="preserve">  • x_k: </w:t>
             </w:r>
-          </w:p>
-        </w:tc>
-        <w:tc>
-          <w:tcPr>
-            <w:tcW w:type="dxa" w:w="3106"/>
-            <w:shd w:val="clear" w:color="auto" w:fill="FFFFFF"/>
-            <w:tcMar>
-              <w:top w:w="120" w:type="dxa"/>
-              <w:bottom w:w="120" w:type="dxa"/>
-              <w:left w:w="150" w:type="dxa"/>
-              <w:right w:w="150" w:type="dxa"/>
-            </w:tcMar>
-          </w:tcPr>
-          <w:p>
-            <w:pPr>
-              <w:jc w:val="center"/>
-            </w:pPr>
             <w:r>
-              <w:t>2.5</w:t>
+              <w:rPr>
+                <w:sz w:val="19"/>
+              </w:rPr>
+              <w:t>Giá trị linh kiện k của laptop ứng viên trong kho dữ liệu 225 máy</w:t>
+              <w:br/>
             </w:r>
-          </w:p>
-        </w:tc>
-        <w:tc>
-          <w:tcPr>
-            <w:tcW w:type="dxa" w:w="3106"/>
-            <w:shd w:val="clear" w:color="auto" w:fill="FFFFFF"/>
-            <w:tcMar>
-              <w:top w:w="120" w:type="dxa"/>
-              <w:bottom w:w="120" w:type="dxa"/>
-              <w:left w:w="150" w:type="dxa"/>
-              <w:right w:w="150" w:type="dxa"/>
-            </w:tcMar>
-          </w:tcPr>
-          <w:p>
             <w:r>
-              <w:t>Rất cao – Quyết định khả năng xử lý đồ họa, render &amp; game.</w:t>
+              <w:rPr>
+                <w:b/>
+                <w:sz w:val="19"/>
+              </w:rPr>
+              <w:t xml:space="preserve">  • x_user,k: </w:t>
             </w:r>
-          </w:p>
-        </w:tc>
-      </w:tr>
-      <w:tr>
-        <w:tc>
-          <w:tcPr>
-            <w:tcW w:type="dxa" w:w="3106"/>
-            <w:shd w:val="clear" w:color="auto" w:fill="F8F9FA"/>
-            <w:tcMar>
-              <w:top w:w="120" w:type="dxa"/>
-              <w:bottom w:w="120" w:type="dxa"/>
-              <w:left w:w="150" w:type="dxa"/>
-              <w:right w:w="150" w:type="dxa"/>
-            </w:tcMar>
-          </w:tcPr>
-          <w:p>
             <w:r>
-              <w:t>ram (Dung lượng RAM)</w:t>
+              <w:rPr>
+                <w:sz w:val="19"/>
+              </w:rPr>
+              <w:t>Giá trị linh kiện k do người dùng mong muốn nhập trên form</w:t>
+              <w:br/>
             </w:r>
-          </w:p>
-        </w:tc>
-        <w:tc>
-          <w:tcPr>
-            <w:tcW w:type="dxa" w:w="3106"/>
-            <w:shd w:val="clear" w:color="auto" w:fill="F8F9FA"/>
-            <w:tcMar>
-              <w:top w:w="120" w:type="dxa"/>
-              <w:bottom w:w="120" w:type="dxa"/>
-              <w:left w:w="150" w:type="dxa"/>
-              <w:right w:w="150" w:type="dxa"/>
-            </w:tcMar>
-          </w:tcPr>
-          <w:p>
-            <w:pPr>
-              <w:jc w:val="center"/>
-            </w:pPr>
             <w:r>
-              <w:t>2.0</w:t>
+              <w:rPr>
+                <w:b/>
+                <w:sz w:val="19"/>
+              </w:rPr>
+              <w:t xml:space="preserve">  • σ_k: </w:t>
             </w:r>
-          </w:p>
-        </w:tc>
-        <w:tc>
-          <w:tcPr>
-            <w:tcW w:type="dxa" w:w="3106"/>
-            <w:shd w:val="clear" w:color="auto" w:fill="F8F9FA"/>
-            <w:tcMar>
-              <w:top w:w="120" w:type="dxa"/>
-              <w:bottom w:w="120" w:type="dxa"/>
-              <w:left w:w="150" w:type="dxa"/>
-              <w:right w:w="150" w:type="dxa"/>
-            </w:tcMar>
-          </w:tcPr>
-          <w:p>
             <w:r>
-              <w:t>Cao – Khả năng chạy đa nhiệm và mở nhiều tác vụ.</w:t>
-            </w:r>
-          </w:p>
-        </w:tc>
-      </w:tr>
-      <w:tr>
-        <w:tc>
-          <w:tcPr>
-            <w:tcW w:type="dxa" w:w="3106"/>
-            <w:shd w:val="clear" w:color="auto" w:fill="FFFFFF"/>
-            <w:tcMar>
-              <w:top w:w="120" w:type="dxa"/>
-              <w:bottom w:w="120" w:type="dxa"/>
-              <w:left w:w="150" w:type="dxa"/>
-              <w:right w:w="150" w:type="dxa"/>
-            </w:tcMar>
-          </w:tcPr>
-          <w:p>
-            <w:r>
-              <w:t>storage (Dung lượng SSD)</w:t>
-            </w:r>
-          </w:p>
-        </w:tc>
-        <w:tc>
-          <w:tcPr>
-            <w:tcW w:type="dxa" w:w="3106"/>
-            <w:shd w:val="clear" w:color="auto" w:fill="FFFFFF"/>
-            <w:tcMar>
-              <w:top w:w="120" w:type="dxa"/>
-              <w:bottom w:w="120" w:type="dxa"/>
-              <w:left w:w="150" w:type="dxa"/>
-              <w:right w:w="150" w:type="dxa"/>
-            </w:tcMar>
-          </w:tcPr>
-          <w:p>
-            <w:pPr>
-              <w:jc w:val="center"/>
-            </w:pPr>
-            <w:r>
-              <w:t>1.5</w:t>
-            </w:r>
-          </w:p>
-        </w:tc>
-        <w:tc>
-          <w:tcPr>
-            <w:tcW w:type="dxa" w:w="3106"/>
-            <w:shd w:val="clear" w:color="auto" w:fill="FFFFFF"/>
-            <w:tcMar>
-              <w:top w:w="120" w:type="dxa"/>
-              <w:bottom w:w="120" w:type="dxa"/>
-              <w:left w:w="150" w:type="dxa"/>
-              <w:right w:w="150" w:type="dxa"/>
-            </w:tcMar>
-          </w:tcPr>
-          <w:p>
-            <w:r>
-              <w:t>Trung bình cao – Không gian lưu trữ dữ liệu.</w:t>
-            </w:r>
-          </w:p>
-        </w:tc>
-      </w:tr>
-      <w:tr>
-        <w:tc>
-          <w:tcPr>
-            <w:tcW w:type="dxa" w:w="3106"/>
-            <w:shd w:val="clear" w:color="auto" w:fill="F8F9FA"/>
-            <w:tcMar>
-              <w:top w:w="120" w:type="dxa"/>
-              <w:bottom w:w="120" w:type="dxa"/>
-              <w:left w:w="150" w:type="dxa"/>
-              <w:right w:w="150" w:type="dxa"/>
-            </w:tcMar>
-          </w:tcPr>
-          <w:p>
-            <w:r>
-              <w:t>screen_size (Màn hình)</w:t>
-            </w:r>
-          </w:p>
-        </w:tc>
-        <w:tc>
-          <w:tcPr>
-            <w:tcW w:type="dxa" w:w="3106"/>
-            <w:shd w:val="clear" w:color="auto" w:fill="F8F9FA"/>
-            <w:tcMar>
-              <w:top w:w="120" w:type="dxa"/>
-              <w:bottom w:w="120" w:type="dxa"/>
-              <w:left w:w="150" w:type="dxa"/>
-              <w:right w:w="150" w:type="dxa"/>
-            </w:tcMar>
-          </w:tcPr>
-          <w:p>
-            <w:pPr>
-              <w:jc w:val="center"/>
-            </w:pPr>
-            <w:r>
-              <w:t>1.0</w:t>
-            </w:r>
-          </w:p>
-        </w:tc>
-        <w:tc>
-          <w:tcPr>
-            <w:tcW w:type="dxa" w:w="3106"/>
-            <w:shd w:val="clear" w:color="auto" w:fill="F8F9FA"/>
-            <w:tcMar>
-              <w:top w:w="120" w:type="dxa"/>
-              <w:bottom w:w="120" w:type="dxa"/>
-              <w:left w:w="150" w:type="dxa"/>
-              <w:right w:w="150" w:type="dxa"/>
-            </w:tcMar>
-          </w:tcPr>
-          <w:p>
-            <w:r>
-              <w:t>Tiêu chuẩn – Yếu tố kích thước hiển thị.</w:t>
-            </w:r>
-          </w:p>
-        </w:tc>
-      </w:tr>
-      <w:tr>
-        <w:tc>
-          <w:tcPr>
-            <w:tcW w:type="dxa" w:w="3106"/>
-            <w:shd w:val="clear" w:color="auto" w:fill="FFFFFF"/>
-            <w:tcMar>
-              <w:top w:w="120" w:type="dxa"/>
-              <w:bottom w:w="120" w:type="dxa"/>
-              <w:left w:w="150" w:type="dxa"/>
-              <w:right w:w="150" w:type="dxa"/>
-            </w:tcMar>
-          </w:tcPr>
-          <w:p>
-            <w:r>
-              <w:t>refresh_rate (Tần số quét)</w:t>
-            </w:r>
-          </w:p>
-        </w:tc>
-        <w:tc>
-          <w:tcPr>
-            <w:tcW w:type="dxa" w:w="3106"/>
-            <w:shd w:val="clear" w:color="auto" w:fill="FFFFFF"/>
-            <w:tcMar>
-              <w:top w:w="120" w:type="dxa"/>
-              <w:bottom w:w="120" w:type="dxa"/>
-              <w:left w:w="150" w:type="dxa"/>
-              <w:right w:w="150" w:type="dxa"/>
-            </w:tcMar>
-          </w:tcPr>
-          <w:p>
-            <w:pPr>
-              <w:jc w:val="center"/>
-            </w:pPr>
-            <w:r>
-              <w:t>1.0</w:t>
-            </w:r>
-          </w:p>
-        </w:tc>
-        <w:tc>
-          <w:tcPr>
-            <w:tcW w:type="dxa" w:w="3106"/>
-            <w:shd w:val="clear" w:color="auto" w:fill="FFFFFF"/>
-            <w:tcMar>
-              <w:top w:w="120" w:type="dxa"/>
-              <w:bottom w:w="120" w:type="dxa"/>
-              <w:left w:w="150" w:type="dxa"/>
-              <w:right w:w="150" w:type="dxa"/>
-            </w:tcMar>
-          </w:tcPr>
-          <w:p>
-            <w:r>
-              <w:t>Tiêu chuẩn – Độ mượt mà khi chơi game hoặc xem nội dung.</w:t>
-            </w:r>
-          </w:p>
-        </w:tc>
-      </w:tr>
-      <w:tr>
-        <w:tc>
-          <w:tcPr>
-            <w:tcW w:type="dxa" w:w="3106"/>
-            <w:shd w:val="clear" w:color="auto" w:fill="F8F9FA"/>
-            <w:tcMar>
-              <w:top w:w="120" w:type="dxa"/>
-              <w:bottom w:w="120" w:type="dxa"/>
-              <w:left w:w="150" w:type="dxa"/>
-              <w:right w:w="150" w:type="dxa"/>
-            </w:tcMar>
-          </w:tcPr>
-          <w:p>
-            <w:r>
-              <w:t>weight (Trọng lượng)</w:t>
-            </w:r>
-          </w:p>
-        </w:tc>
-        <w:tc>
-          <w:tcPr>
-            <w:tcW w:type="dxa" w:w="3106"/>
-            <w:shd w:val="clear" w:color="auto" w:fill="F8F9FA"/>
-            <w:tcMar>
-              <w:top w:w="120" w:type="dxa"/>
-              <w:bottom w:w="120" w:type="dxa"/>
-              <w:left w:w="150" w:type="dxa"/>
-              <w:right w:w="150" w:type="dxa"/>
-            </w:tcMar>
-          </w:tcPr>
-          <w:p>
-            <w:pPr>
-              <w:jc w:val="center"/>
-            </w:pPr>
-            <w:r>
-              <w:t>1.0</w:t>
-            </w:r>
-          </w:p>
-        </w:tc>
-        <w:tc>
-          <w:tcPr>
-            <w:tcW w:type="dxa" w:w="3106"/>
-            <w:shd w:val="clear" w:color="auto" w:fill="F8F9FA"/>
-            <w:tcMar>
-              <w:top w:w="120" w:type="dxa"/>
-              <w:bottom w:w="120" w:type="dxa"/>
-              <w:left w:w="150" w:type="dxa"/>
-              <w:right w:w="150" w:type="dxa"/>
-            </w:tcMar>
-          </w:tcPr>
-          <w:p>
-            <w:r>
-              <w:t>Tiêu chuẩn – Tính cơ động khi di chuyển.</w:t>
-            </w:r>
-          </w:p>
-        </w:tc>
-      </w:tr>
-      <w:tr>
-        <w:tc>
-          <w:tcPr>
-            <w:tcW w:type="dxa" w:w="3106"/>
-            <w:shd w:val="clear" w:color="auto" w:fill="FFFFFF"/>
-            <w:tcMar>
-              <w:top w:w="120" w:type="dxa"/>
-              <w:bottom w:w="120" w:type="dxa"/>
-              <w:left w:w="150" w:type="dxa"/>
-              <w:right w:w="150" w:type="dxa"/>
-            </w:tcMar>
-          </w:tcPr>
-          <w:p>
-            <w:r>
-              <w:t>battery (Dung lượng Pin)</w:t>
-            </w:r>
-          </w:p>
-        </w:tc>
-        <w:tc>
-          <w:tcPr>
-            <w:tcW w:type="dxa" w:w="3106"/>
-            <w:shd w:val="clear" w:color="auto" w:fill="FFFFFF"/>
-            <w:tcMar>
-              <w:top w:w="120" w:type="dxa"/>
-              <w:bottom w:w="120" w:type="dxa"/>
-              <w:left w:w="150" w:type="dxa"/>
-              <w:right w:w="150" w:type="dxa"/>
-            </w:tcMar>
-          </w:tcPr>
-          <w:p>
-            <w:pPr>
-              <w:jc w:val="center"/>
-            </w:pPr>
-            <w:r>
-              <w:t>1.0</w:t>
-            </w:r>
-          </w:p>
-        </w:tc>
-        <w:tc>
-          <w:tcPr>
-            <w:tcW w:type="dxa" w:w="3106"/>
-            <w:shd w:val="clear" w:color="auto" w:fill="FFFFFF"/>
-            <w:tcMar>
-              <w:top w:w="120" w:type="dxa"/>
-              <w:bottom w:w="120" w:type="dxa"/>
-              <w:left w:w="150" w:type="dxa"/>
-              <w:right w:w="150" w:type="dxa"/>
-            </w:tcMar>
-          </w:tcPr>
-          <w:p>
-            <w:r>
-              <w:t>Tiêu chuẩn – Thời lượng sử dụng độc lập nguồn điện.</w:t>
+              <w:rPr>
+                <w:sz w:val="19"/>
+              </w:rPr>
+              <w:t>Độ lệch chuẩn của thuộc tính thứ k trên toàn bộ tập dữ liệu (loại bỏ ảnh hưởng bởi đơn vị đo)</w:t>
+              <w:br/>
             </w:r>
           </w:p>
         </w:tc>
@@ -2007,12 +3669,381 @@
         <w:br/>
       </w:r>
       <w:r>
-        <w:t>Khoảng cách chuẩn hóa có trọng số (config_dist) được quy đổi sang tỷ lệ phần trăm tương đồng tiệm cận tự nhiên bằng hàm hàm mũ giảm dần:</w:t>
+        <w:t>Khoảng cách hình học d_config được chuyển đổi sang tỷ lệ phần trăm trực quan thông qua hàm suy giảm hàm mũ (Exponential Decay):</w:t>
+      </w:r>
+    </w:p>
+    <w:tbl>
+      <w:tblPr>
+        <w:tblW w:type="auto" w:w="0"/>
+        <w:jc w:val="center"/>
+        <w:tblLook w:firstColumn="1" w:firstRow="1" w:lastColumn="0" w:lastRow="0" w:noHBand="0" w:noVBand="1" w:val="04A0"/>
+      </w:tblPr>
+      <w:tblGrid>
+        <w:gridCol w:w="9317"/>
+      </w:tblGrid>
+      <w:tr>
+        <w:tc>
+          <w:tcPr>
+            <w:tcW w:type="dxa" w:w="9317"/>
+            <w:shd w:val="clear" w:color="auto" w:fill="F4F8FD"/>
+            <w:tcMar>
+              <w:top w:w="140" w:type="dxa"/>
+              <w:bottom w:w="140" w:type="dxa"/>
+              <w:left w:w="200" w:type="dxa"/>
+              <w:right w:w="200" w:type="dxa"/>
+            </w:tcMar>
+            <w:tcBorders>
+              <w:left w:val="single" w:sz="24" w:space="0" w:color="0D6EFD"/>
+              <w:top w:val="single" w:sz="4" w:space="0" w:color="DEE2E6"/>
+              <w:bottom w:val="single" w:sz="4" w:space="0" w:color="DEE2E6"/>
+              <w:right w:val="single" w:sz="4" w:space="0" w:color="DEE2E6"/>
+            </w:tcBorders>
+          </w:tcPr>
+          <w:p>
+            <w:pPr>
+              <w:spacing w:after="80"/>
+              <w:jc w:val="left"/>
+            </w:pPr>
+            <w:r>
+              <w:rPr>
+                <w:b/>
+                <w:color w:val="0D6EFD"/>
+                <w:sz w:val="22"/>
+              </w:rPr>
+              <w:t>✦ Công thức 9: Tỷ lệ Phần trăm Tương đồng Cấu hình (Similarity Percentage)</w:t>
+            </w:r>
+          </w:p>
+          <w:p>
+            <w:pPr>
+              <w:spacing w:before="160" w:after="160"/>
+              <w:jc w:val="center"/>
+            </w:pPr>
+            <m:oMathPara>
+              <m:oMath>
+                <m:r>
+                  <m:t>Similarity (%) = Clip</m:t>
+                </m:r>
+                <m:d>
+                  <m:dPr>
+                    <m:begChr m:val="("/>
+                    <m:endChr m:val=")"/>
+                  </m:dPr>
+                  <m:e>
+                    <m:r>
+                      <m:t>100 · </m:t>
+                    </m:r>
+                    <m:sSup>
+                      <m:e>
+                        <m:r>
+                          <m:t>e</m:t>
+                        </m:r>
+                      </m:e>
+                      <m:sup>
+                        <m:r>
+                          <m:t>-0.25 · </m:t>
+                        </m:r>
+                        <m:sSub>
+                          <m:e>
+                            <m:r>
+                              <m:t>d</m:t>
+                            </m:r>
+                          </m:e>
+                          <m:sub>
+                            <m:r>
+                              <m:t>config</m:t>
+                            </m:r>
+                          </m:sub>
+                        </m:sSub>
+                      </m:sup>
+                    </m:sSup>
+                    <m:r>
+                      <m:t>,  35.0,  99.5</m:t>
+                    </m:r>
+                  </m:e>
+                </m:d>
+              </m:oMath>
+            </m:oMathPara>
+          </w:p>
+          <w:p>
+            <w:pPr>
+              <w:spacing w:before="80" w:after="0" w:line="288" w:lineRule="auto"/>
+            </w:pPr>
+            <w:r>
+              <w:rPr>
+                <w:b/>
+                <w:i/>
+                <w:sz w:val="19"/>
+              </w:rPr>
+              <w:t>Trong đó:</w:t>
+              <w:br/>
+            </w:r>
+            <w:r>
+              <w:rPr>
+                <w:b/>
+                <w:sz w:val="19"/>
+              </w:rPr>
+              <w:t xml:space="preserve">  • Similarity (%): </w:t>
+            </w:r>
+            <w:r>
+              <w:rPr>
+                <w:sz w:val="19"/>
+              </w:rPr>
+              <w:t>Độ tương đồng cấu hình (%) hiển thị trực tiếp trên thanh tiến trình Progress Bar của từng sản phẩm gợi ý</w:t>
+              <w:br/>
+            </w:r>
+            <w:r>
+              <w:rPr>
+                <w:b/>
+                <w:sz w:val="19"/>
+              </w:rPr>
+              <w:t xml:space="preserve">  • e^(-0.25 · d_config): </w:t>
+            </w:r>
+            <w:r>
+              <w:rPr>
+                <w:sz w:val="19"/>
+              </w:rPr>
+              <w:t>Hàm nhân suy giảm tiệm cận tự nhiên, phản ánh chính xác cảm nhận thực tế của người dùng</w:t>
+              <w:br/>
+            </w:r>
+            <w:r>
+              <w:rPr>
+                <w:b/>
+                <w:sz w:val="19"/>
+              </w:rPr>
+              <w:t xml:space="preserve">  • Clip(v, 35.0, 99.5): </w:t>
+            </w:r>
+            <w:r>
+              <w:rPr>
+                <w:sz w:val="19"/>
+              </w:rPr>
+              <w:t>Hàm giới hạn giá trị trong khoảng từ 35.0% đến tối đa 99.5% (tránh giá trị phi lý)</w:t>
+              <w:br/>
+            </w:r>
+          </w:p>
+        </w:tc>
+      </w:tr>
+    </w:tbl>
+    <w:p>
+      <w:pPr>
+        <w:spacing w:after="120"/>
+      </w:pPr>
+    </w:p>
+    <w:p>
+      <w:r>
+        <w:rPr>
+          <w:b/>
+        </w:rPr>
+        <w:t>4.4. Hàm Xếp hạng Ứng viên kèm Điểm phạt Giá (Ranking Score with Price Penalty):</w:t>
         <w:br/>
-        <w:t xml:space="preserve">    Similarity (%) = Clip(100.0 * exp(-0.25 * config_dist), 35.0, 99.5)</w:t>
-        <w:br/>
-        <w:t>Công thức này đảm bảo tỷ lệ tương đồng phản ánh chính xác trực giác của người dùng: các máy cấu hình gần giống nhau đạt 90-99%, trong khi các máy chênh lệch cấu hình nhiều sẽ giảm dần về ngưỡng sàn 35%.</w:t>
       </w:r>
+      <w:r>
+        <w:t>Để ưu tiên tối đa các mẫu laptop rơi đúng vào dải chênh lệch giá mục tiêu (±2 triệu VNĐ), hệ thống bổ sung hàm phạt phụ trội:</w:t>
+      </w:r>
+    </w:p>
+    <w:tbl>
+      <w:tblPr>
+        <w:tblW w:type="auto" w:w="0"/>
+        <w:jc w:val="center"/>
+        <w:tblLook w:firstColumn="1" w:firstRow="1" w:lastColumn="0" w:lastRow="0" w:noHBand="0" w:noVBand="1" w:val="04A0"/>
+      </w:tblPr>
+      <w:tblGrid>
+        <w:gridCol w:w="9317"/>
+      </w:tblGrid>
+      <w:tr>
+        <w:tc>
+          <w:tcPr>
+            <w:tcW w:type="dxa" w:w="9317"/>
+            <w:shd w:val="clear" w:color="auto" w:fill="F4F8FD"/>
+            <w:tcMar>
+              <w:top w:w="140" w:type="dxa"/>
+              <w:bottom w:w="140" w:type="dxa"/>
+              <w:left w:w="200" w:type="dxa"/>
+              <w:right w:w="200" w:type="dxa"/>
+            </w:tcMar>
+            <w:tcBorders>
+              <w:left w:val="single" w:sz="24" w:space="0" w:color="0D6EFD"/>
+              <w:top w:val="single" w:sz="4" w:space="0" w:color="DEE2E6"/>
+              <w:bottom w:val="single" w:sz="4" w:space="0" w:color="DEE2E6"/>
+              <w:right w:val="single" w:sz="4" w:space="0" w:color="DEE2E6"/>
+            </w:tcBorders>
+          </w:tcPr>
+          <w:p>
+            <w:pPr>
+              <w:spacing w:after="80"/>
+              <w:jc w:val="left"/>
+            </w:pPr>
+            <w:r>
+              <w:rPr>
+                <w:b/>
+                <w:color w:val="0D6EFD"/>
+                <w:sz w:val="22"/>
+              </w:rPr>
+              <w:t>✦ Công thức 10: Hàm Xếp hạng Ứng viên Đề xuất (Ranking Score)</w:t>
+            </w:r>
+          </w:p>
+          <w:p>
+            <w:pPr>
+              <w:spacing w:before="160" w:after="160"/>
+              <w:jc w:val="center"/>
+            </w:pPr>
+            <m:oMathPara>
+              <m:oMath>
+                <m:r>
+                  <m:t>Score = </m:t>
+                </m:r>
+                <m:sSub>
+                  <m:e>
+                    <m:r>
+                      <m:t>d</m:t>
+                    </m:r>
+                  </m:e>
+                  <m:sub>
+                    <m:r>
+                      <m:t>config</m:t>
+                    </m:r>
+                  </m:sub>
+                </m:sSub>
+                <m:r>
+                  <m:t> + 2.5 · max</m:t>
+                </m:r>
+                <m:d>
+                  <m:dPr>
+                    <m:begChr m:val="("/>
+                    <m:endChr m:val=")"/>
+                  </m:dPr>
+                  <m:e>
+                    <m:r>
+                      <m:t>0,  </m:t>
+                    </m:r>
+                    <m:f>
+                      <m:num>
+                        <m:d>
+                          <m:dPr>
+                            <m:begChr m:val="|"/>
+                            <m:endChr m:val="|"/>
+                          </m:dPr>
+                          <m:e>
+                            <m:sSub>
+                              <m:e>
+                                <m:r>
+                                  <m:t>P</m:t>
+                                </m:r>
+                              </m:e>
+                              <m:sub>
+                                <m:r>
+                                  <m:t>actual</m:t>
+                                </m:r>
+                              </m:sub>
+                            </m:sSub>
+                            <m:r>
+                              <m:t>-</m:t>
+                            </m:r>
+                            <m:sSub>
+                              <m:e>
+                                <m:r>
+                                  <m:t>P</m:t>
+                                </m:r>
+                              </m:e>
+                              <m:sub>
+                                <m:r>
+                                  <m:t>pred</m:t>
+                                </m:r>
+                              </m:sub>
+                            </m:sSub>
+                          </m:e>
+                        </m:d>
+                        <m:r>
+                          <m:t>- 2,000,000</m:t>
+                        </m:r>
+                      </m:num>
+                      <m:den>
+                        <m:r>
+                          <m:t>1,000,000</m:t>
+                        </m:r>
+                      </m:den>
+                    </m:f>
+                  </m:e>
+                </m:d>
+              </m:oMath>
+            </m:oMathPara>
+          </w:p>
+          <w:p>
+            <w:pPr>
+              <w:spacing w:before="80" w:after="0" w:line="288" w:lineRule="auto"/>
+            </w:pPr>
+            <w:r>
+              <w:rPr>
+                <w:b/>
+                <w:i/>
+                <w:sz w:val="19"/>
+              </w:rPr>
+              <w:t>Trong đó:</w:t>
+              <w:br/>
+            </w:r>
+            <w:r>
+              <w:rPr>
+                <w:b/>
+                <w:sz w:val="19"/>
+              </w:rPr>
+              <w:t xml:space="preserve">  • Score: </w:t>
+            </w:r>
+            <w:r>
+              <w:rPr>
+                <w:sz w:val="19"/>
+              </w:rPr>
+              <w:t>Chỉ số xếp hạng tổng hợp (máy có điểm Score nhỏ nhất sẽ được xếp vị trí #1 - Tương đồng nhất)</w:t>
+              <w:br/>
+            </w:r>
+            <w:r>
+              <w:rPr>
+                <w:b/>
+                <w:sz w:val="19"/>
+              </w:rPr>
+              <w:t xml:space="preserve">  • |P_actual - P_pred|: </w:t>
+            </w:r>
+            <w:r>
+              <w:rPr>
+                <w:sz w:val="19"/>
+              </w:rPr>
+              <w:t>Khoảng cách chênh lệch tuyệt đối giữa giá bán niêm yết thực tế và giá dự đoán (VNĐ)</w:t>
+              <w:br/>
+            </w:r>
+            <w:r>
+              <w:rPr>
+                <w:b/>
+                <w:sz w:val="19"/>
+              </w:rPr>
+              <w:t xml:space="preserve">  • 2,000,000 VNĐ: </w:t>
+            </w:r>
+            <w:r>
+              <w:rPr>
+                <w:sz w:val="19"/>
+              </w:rPr>
+              <w:t>Ngưỡng chênh lệch giá mục tiêu ban đầu</w:t>
+              <w:br/>
+            </w:r>
+            <w:r>
+              <w:rPr>
+                <w:b/>
+                <w:sz w:val="19"/>
+              </w:rPr>
+              <w:t xml:space="preserve">  • 2.5: </w:t>
+            </w:r>
+            <w:r>
+              <w:rPr>
+                <w:sz w:val="19"/>
+              </w:rPr>
+              <w:t>Hệ số phạt phụ trội đối với các mẫu vượt ngoài dải 2 triệu đồng để bảo vệ tiêu chí giá cả</w:t>
+              <w:br/>
+            </w:r>
+          </w:p>
+        </w:tc>
+      </w:tr>
+    </w:tbl>
+    <w:p>
+      <w:pPr>
+        <w:spacing w:after="120"/>
+      </w:pPr>
     </w:p>
     <w:p>
       <w:pPr>
@@ -2031,13 +4062,13 @@
         <w:br/>
       </w:r>
       <w:r>
-        <w:t>• Lớp 1 (Preset 1-Click theo Ngành học): Người dùng chỉ cần nhấp vào 1 trong 3 ngành học phổ biến (Kinh tế / Văn phòng, CNTT / Lập trình, Đồ họa / Gaming), hệ thống JavaScript sẽ tự động điền các thông số kỹ thuật chuẩn, tạo hiệu ứng cuộn mượt và highlight viền xanh tức thì.</w:t>
+        <w:t>• Lớp 1 (1-Click Preset theo Ngành học): 3 khối thẻ ngành học (Kinh tế / Văn phòng, CNTT / Lập trình, Đồ họa &amp; Gaming) kèm script JavaScript tự động điền các thông số kỹ thuật chuẩn và hiệu ứng highlight viền xanh tức thì.</w:t>
         <w:br/>
-        <w:t>• Lớp 2 (Form Tinh chỉnh 9 Thông số): Người dùng có thể tự do điều chỉnh từng thông số kỹ thuật với đầy đủ nhãn giải thích và gợi ý giá trị tiêu chuẩn.</w:t>
+        <w:t>• Lớp 2 (Form Tinh chỉnh 9 Thông số): Form nhập liệu có validation kiểm tra giá trị âm, rỗng, giới hạn logic màn hình và trọng lượng.</w:t>
         <w:br/>
-        <w:t>• Thẻ Kết quả Định giá: Hiển thị mức giá ước tính định dạng tiền tệ VNĐ nổi bật, đi kèm thẻ so sánh trực quan (Tiết kiệm hơn / Cao hơn bao nhiêu tiền).</w:t>
+        <w:t>• Thẻ Kết quả Định giá: Hiển thị giá ước tính định dạng tiền tệ VNĐ nổi bật kèm huy hiệu so sánh chênh lệch (tiết kiệm hơn / cao hơn).</w:t>
         <w:br/>
-        <w:t>• Bảng Top 5 Laptop Đề xuất: Mỗi mẫu laptop hiển thị đầy đủ thương hiệu, tên model, giá bán, thanh tiến trình % tương đồng cấu hình và nút xem trực tiếp trong kho máy.</w:t>
+        <w:t>• Bảng Top 5 Laptop Đề xuất: Danh sách 5 mẫu kèm thanh tiến trình % tương đồng cấu hình và nút liên kết trực tiếp vào kho máy.</w:t>
       </w:r>
     </w:p>
     <w:p>
@@ -2067,10 +4098,10 @@
             <w:tcW w:type="dxa" w:w="2329"/>
             <w:shd w:val="clear" w:color="auto" w:fill="0D6EFD"/>
             <w:tcMar>
-              <w:top w:w="120" w:type="dxa"/>
-              <w:bottom w:w="120" w:type="dxa"/>
-              <w:left w:w="150" w:type="dxa"/>
-              <w:right w:w="150" w:type="dxa"/>
+              <w:top w:w="140" w:type="dxa"/>
+              <w:bottom w:w="140" w:type="dxa"/>
+              <w:left w:w="180" w:type="dxa"/>
+              <w:right w:w="180" w:type="dxa"/>
             </w:tcMar>
           </w:tcPr>
           <w:p>
@@ -2091,10 +4122,10 @@
             <w:tcW w:type="dxa" w:w="2329"/>
             <w:shd w:val="clear" w:color="auto" w:fill="0D6EFD"/>
             <w:tcMar>
-              <w:top w:w="120" w:type="dxa"/>
-              <w:bottom w:w="120" w:type="dxa"/>
-              <w:left w:w="150" w:type="dxa"/>
-              <w:right w:w="150" w:type="dxa"/>
+              <w:top w:w="140" w:type="dxa"/>
+              <w:bottom w:w="140" w:type="dxa"/>
+              <w:left w:w="180" w:type="dxa"/>
+              <w:right w:w="180" w:type="dxa"/>
             </w:tcMar>
           </w:tcPr>
           <w:p>
@@ -2115,10 +4146,10 @@
             <w:tcW w:type="dxa" w:w="2329"/>
             <w:shd w:val="clear" w:color="auto" w:fill="0D6EFD"/>
             <w:tcMar>
-              <w:top w:w="120" w:type="dxa"/>
-              <w:bottom w:w="120" w:type="dxa"/>
-              <w:left w:w="150" w:type="dxa"/>
-              <w:right w:w="150" w:type="dxa"/>
+              <w:top w:w="140" w:type="dxa"/>
+              <w:bottom w:w="140" w:type="dxa"/>
+              <w:left w:w="180" w:type="dxa"/>
+              <w:right w:w="180" w:type="dxa"/>
             </w:tcMar>
           </w:tcPr>
           <w:p>
@@ -2139,10 +4170,10 @@
             <w:tcW w:type="dxa" w:w="2329"/>
             <w:shd w:val="clear" w:color="auto" w:fill="0D6EFD"/>
             <w:tcMar>
-              <w:top w:w="120" w:type="dxa"/>
-              <w:bottom w:w="120" w:type="dxa"/>
-              <w:left w:w="150" w:type="dxa"/>
-              <w:right w:w="150" w:type="dxa"/>
+              <w:top w:w="140" w:type="dxa"/>
+              <w:bottom w:w="140" w:type="dxa"/>
+              <w:left w:w="180" w:type="dxa"/>
+              <w:right w:w="180" w:type="dxa"/>
             </w:tcMar>
           </w:tcPr>
           <w:p>
@@ -2165,10 +4196,10 @@
             <w:tcW w:type="dxa" w:w="2329"/>
             <w:shd w:val="clear" w:color="auto" w:fill="F8F9FA"/>
             <w:tcMar>
-              <w:top w:w="120" w:type="dxa"/>
-              <w:bottom w:w="120" w:type="dxa"/>
-              <w:left w:w="150" w:type="dxa"/>
-              <w:right w:w="150" w:type="dxa"/>
+              <w:top w:w="140" w:type="dxa"/>
+              <w:bottom w:w="140" w:type="dxa"/>
+              <w:left w:w="180" w:type="dxa"/>
+              <w:right w:w="180" w:type="dxa"/>
             </w:tcMar>
           </w:tcPr>
           <w:p>
@@ -2185,10 +4216,10 @@
             <w:tcW w:type="dxa" w:w="2329"/>
             <w:shd w:val="clear" w:color="auto" w:fill="F8F9FA"/>
             <w:tcMar>
-              <w:top w:w="120" w:type="dxa"/>
-              <w:bottom w:w="120" w:type="dxa"/>
-              <w:left w:w="150" w:type="dxa"/>
-              <w:right w:w="150" w:type="dxa"/>
+              <w:top w:w="140" w:type="dxa"/>
+              <w:bottom w:w="140" w:type="dxa"/>
+              <w:left w:w="180" w:type="dxa"/>
+              <w:right w:w="180" w:type="dxa"/>
             </w:tcMar>
           </w:tcPr>
           <w:p>
@@ -2202,10 +4233,10 @@
             <w:tcW w:type="dxa" w:w="2329"/>
             <w:shd w:val="clear" w:color="auto" w:fill="F8F9FA"/>
             <w:tcMar>
-              <w:top w:w="120" w:type="dxa"/>
-              <w:bottom w:w="120" w:type="dxa"/>
-              <w:left w:w="150" w:type="dxa"/>
-              <w:right w:w="150" w:type="dxa"/>
+              <w:top w:w="140" w:type="dxa"/>
+              <w:bottom w:w="140" w:type="dxa"/>
+              <w:left w:w="180" w:type="dxa"/>
+              <w:right w:w="180" w:type="dxa"/>
             </w:tcMar>
           </w:tcPr>
           <w:p>
@@ -2222,15 +4253,15 @@
             <w:tcW w:type="dxa" w:w="2329"/>
             <w:shd w:val="clear" w:color="auto" w:fill="F8F9FA"/>
             <w:tcMar>
-              <w:top w:w="120" w:type="dxa"/>
-              <w:bottom w:w="120" w:type="dxa"/>
-              <w:left w:w="150" w:type="dxa"/>
-              <w:right w:w="150" w:type="dxa"/>
+              <w:top w:w="140" w:type="dxa"/>
+              <w:bottom w:w="140" w:type="dxa"/>
+              <w:left w:w="180" w:type="dxa"/>
+              <w:right w:w="180" w:type="dxa"/>
             </w:tcMar>
           </w:tcPr>
           <w:p>
             <w:r>
-              <w:t>Hiển thị trang định giá, 3 preset mẫu và các chỉ số MAE/RMSE/R² của mô hình.</w:t>
+              <w:t>Hiển thị form định giá, 3 preset mẫu ngành học và chỉ số MAE/RMSE/R² của mô hình.</w:t>
             </w:r>
           </w:p>
         </w:tc>
@@ -2241,10 +4272,10 @@
             <w:tcW w:type="dxa" w:w="2329"/>
             <w:shd w:val="clear" w:color="auto" w:fill="FFFFFF"/>
             <w:tcMar>
-              <w:top w:w="120" w:type="dxa"/>
-              <w:bottom w:w="120" w:type="dxa"/>
-              <w:left w:w="150" w:type="dxa"/>
-              <w:right w:w="150" w:type="dxa"/>
+              <w:top w:w="140" w:type="dxa"/>
+              <w:bottom w:w="140" w:type="dxa"/>
+              <w:left w:w="180" w:type="dxa"/>
+              <w:right w:w="180" w:type="dxa"/>
             </w:tcMar>
           </w:tcPr>
           <w:p>
@@ -2261,10 +4292,10 @@
             <w:tcW w:type="dxa" w:w="2329"/>
             <w:shd w:val="clear" w:color="auto" w:fill="FFFFFF"/>
             <w:tcMar>
-              <w:top w:w="120" w:type="dxa"/>
-              <w:bottom w:w="120" w:type="dxa"/>
-              <w:left w:w="150" w:type="dxa"/>
-              <w:right w:w="150" w:type="dxa"/>
+              <w:top w:w="140" w:type="dxa"/>
+              <w:bottom w:w="140" w:type="dxa"/>
+              <w:left w:w="180" w:type="dxa"/>
+              <w:right w:w="180" w:type="dxa"/>
             </w:tcMar>
           </w:tcPr>
           <w:p>
@@ -2278,10 +4309,10 @@
             <w:tcW w:type="dxa" w:w="2329"/>
             <w:shd w:val="clear" w:color="auto" w:fill="FFFFFF"/>
             <w:tcMar>
-              <w:top w:w="120" w:type="dxa"/>
-              <w:bottom w:w="120" w:type="dxa"/>
-              <w:left w:w="150" w:type="dxa"/>
-              <w:right w:w="150" w:type="dxa"/>
+              <w:top w:w="140" w:type="dxa"/>
+              <w:bottom w:w="140" w:type="dxa"/>
+              <w:left w:w="180" w:type="dxa"/>
+              <w:right w:w="180" w:type="dxa"/>
             </w:tcMar>
           </w:tcPr>
           <w:p>
@@ -2298,15 +4329,15 @@
             <w:tcW w:type="dxa" w:w="2329"/>
             <w:shd w:val="clear" w:color="auto" w:fill="FFFFFF"/>
             <w:tcMar>
-              <w:top w:w="120" w:type="dxa"/>
-              <w:bottom w:w="120" w:type="dxa"/>
-              <w:left w:w="150" w:type="dxa"/>
-              <w:right w:w="150" w:type="dxa"/>
+              <w:top w:w="140" w:type="dxa"/>
+              <w:bottom w:w="140" w:type="dxa"/>
+              <w:left w:w="180" w:type="dxa"/>
+              <w:right w:w="180" w:type="dxa"/>
             </w:tcMar>
           </w:tcPr>
           <w:p>
             <w:r>
-              <w:t>Xác thực dữ liệu đầu vào (Validation), tính toán giá ước tính và hiển thị Top 5 gợi ý.</w:t>
+              <w:t>Xác thực dữ liệu đầu vào, ước tính giá bán bằng ML và hiển thị Top 5 gợi ý.</w:t>
             </w:r>
           </w:p>
         </w:tc>
@@ -2317,10 +4348,10 @@
             <w:tcW w:type="dxa" w:w="2329"/>
             <w:shd w:val="clear" w:color="auto" w:fill="F8F9FA"/>
             <w:tcMar>
-              <w:top w:w="120" w:type="dxa"/>
-              <w:bottom w:w="120" w:type="dxa"/>
-              <w:left w:w="150" w:type="dxa"/>
-              <w:right w:w="150" w:type="dxa"/>
+              <w:top w:w="140" w:type="dxa"/>
+              <w:bottom w:w="140" w:type="dxa"/>
+              <w:left w:w="180" w:type="dxa"/>
+              <w:right w:w="180" w:type="dxa"/>
             </w:tcMar>
           </w:tcPr>
           <w:p>
@@ -2337,10 +4368,10 @@
             <w:tcW w:type="dxa" w:w="2329"/>
             <w:shd w:val="clear" w:color="auto" w:fill="F8F9FA"/>
             <w:tcMar>
-              <w:top w:w="120" w:type="dxa"/>
-              <w:bottom w:w="120" w:type="dxa"/>
-              <w:left w:w="150" w:type="dxa"/>
-              <w:right w:w="150" w:type="dxa"/>
+              <w:top w:w="140" w:type="dxa"/>
+              <w:bottom w:w="140" w:type="dxa"/>
+              <w:left w:w="180" w:type="dxa"/>
+              <w:right w:w="180" w:type="dxa"/>
             </w:tcMar>
           </w:tcPr>
           <w:p>
@@ -2354,10 +4385,10 @@
             <w:tcW w:type="dxa" w:w="2329"/>
             <w:shd w:val="clear" w:color="auto" w:fill="F8F9FA"/>
             <w:tcMar>
-              <w:top w:w="120" w:type="dxa"/>
-              <w:bottom w:w="120" w:type="dxa"/>
-              <w:left w:w="150" w:type="dxa"/>
-              <w:right w:w="150" w:type="dxa"/>
+              <w:top w:w="140" w:type="dxa"/>
+              <w:bottom w:w="140" w:type="dxa"/>
+              <w:left w:w="180" w:type="dxa"/>
+              <w:right w:w="180" w:type="dxa"/>
             </w:tcMar>
           </w:tcPr>
           <w:p>
@@ -2374,10 +4405,10 @@
             <w:tcW w:type="dxa" w:w="2329"/>
             <w:shd w:val="clear" w:color="auto" w:fill="F8F9FA"/>
             <w:tcMar>
-              <w:top w:w="120" w:type="dxa"/>
-              <w:bottom w:w="120" w:type="dxa"/>
-              <w:left w:w="150" w:type="dxa"/>
-              <w:right w:w="150" w:type="dxa"/>
+              <w:top w:w="140" w:type="dxa"/>
+              <w:bottom w:w="140" w:type="dxa"/>
+              <w:left w:w="180" w:type="dxa"/>
+              <w:right w:w="180" w:type="dxa"/>
             </w:tcMar>
           </w:tcPr>
           <w:p>
@@ -2420,7 +4451,7 @@
         <w:t xml:space="preserve">    .\.venv\Scripts\Activate.ps1</w:t>
         <w:br/>
         <w:br/>
-        <w:t>Bước 3: (Tùy chọn) Chạy kiểm thử huấn luyện và đánh giá độc lập module Học máy:</w:t>
+        <w:t>Bước 3: (Tùy chọn) Chạy kiểm thử độc lập module Học máy:</w:t>
         <w:br/>
         <w:t xml:space="preserve">    python -m src.price_prediction</w:t>
         <w:br/>
@@ -2430,7 +4461,7 @@
         <w:t xml:space="preserve">    python app.py</w:t>
         <w:br/>
         <w:br/>
-        <w:t>Bước 5: Truy cập trình duyệt web tại địa chỉ:</w:t>
+        <w:t>Bước 5: Trải nghiệm trên trình duyệt web tại địa chỉ:</w:t>
         <w:br/>
         <w:t xml:space="preserve">    http://127.0.0.1:5000/predict</w:t>
       </w:r>
@@ -2444,15 +4475,15 @@
         <w:br/>
       </w:r>
       <w:r>
-        <w:t>Toàn bộ các bài kiểm tra tự động (Unit Test &amp; Integration Test) đã được thực thi và đạt tỷ lệ thành công 100%:</w:t>
+        <w:t>Toàn bộ các ca kiểm thử tự động đã được thực thi và vượt qua 100%:</w:t>
         <w:br/>
-        <w:t>• Test 1 (GET /): Mã trạng thái HTTP 200 OK, hiển thị đầy đủ số liệu 225 mẫu laptop và banner Phần 4.</w:t>
+        <w:t>• Test 1 (GET /): HTTP 200 OK, hiển thị đầy đủ 225 mẫu laptop và Banner giới thiệu Phần 4.</w:t>
         <w:br/>
-        <w:t>• Test 2 (GET /predict): Mã trạng thái HTTP 200 OK, nạp đúng model payload và hiển thị form định giá.</w:t>
+        <w:t>• Test 2 (GET /predict): HTTP 200 OK, tải mô hình Joblib thành công, nạp đủ 3 preset ngành học.</w:t>
         <w:br/>
-        <w:t>• Test 3 (POST /predict): Mã trạng thái HTTP 200 OK, form validation hoạt động chuẩn xác, hiển thị kết quả giá ước tính và Top 5 laptop tương đồng.</w:t>
+        <w:t>• Test 3 (POST /predict): HTTP 200 OK, form validation chính xác, hiển thị giá ước tính và Top 5 laptop tương đồng.</w:t>
         <w:br/>
-        <w:t>• Test 4 (POST /api/predict): Mã trạng thái HTTP 200 OK, phản hồi JSON đầy đủ trường status: 'success', predicted_price_formatted và recommendations.</w:t>
+        <w:t>• Test 4 (POST /api/predict): HTTP 200 OK, trả về JSON chuẩn gồm status: 'success', predicted_price_formatted và mảng recommendations.</w:t>
       </w:r>
     </w:p>
     <w:p>
@@ -2465,7 +4496,7 @@
     </w:p>
     <w:p>
       <w:r>
-        <w:t>Phần 4: Xây dựng Mô hình Học máy Dự đoán Giá Laptop đã được hoàn thành xuất sắc và tích hợp toàn diện vào dự án Laptops. Mô hình đạt độ chính xác cao (R² đạt 88.21%), thuật toán gợi ý sản phẩm thông minh và giao diện người dùng thân thiện, hiện đại. Hệ thống không chỉ đáp ứng trọn vẹn các yêu cầu học thuật khắt khe của môn học Khoa học Dữ liệu mà còn mang tính ứng dụng thực tiễn cao, trở thành một công cụ tư vấn mua sắm công nghệ đáng tin cậy cho sinh viên và cộng đồng người dùng.</w:t>
+        <w:t>Phần 4: Xây dựng Mô hình Học máy Dự đoán Giá Laptop đã được hoàn thành xuất sắc, tích hợp trọn vẹn từ tầng thuật toán hồi quy, đóng gói mô hình bằng Joblib cho đến tầng giao diện web và dịch vụ REST API. Mô hình đạt độ chính xác ấn tượng (R² đạt 88.21%), các công thức toán học được chuẩn hóa bài bản và chặt chẽ. Hệ thống không chỉ hoàn thành xuất sắc các mục tiêu học thuật của môn Khoa học Dữ liệu mà còn trở thành công cụ tư vấn mua sắm công nghệ hữu ích, trực quan và đáng tin cậy cho sinh viên.</w:t>
       </w:r>
     </w:p>
     <w:sectPr>

</xml_diff>